<commit_message>
Them Bai Tap Moi
</commit_message>
<xml_diff>
--- a/BaiTapChuong/Câu hỏi phản biện.docx
+++ b/BaiTapChuong/Câu hỏi phản biện.docx
@@ -1,6 +1,6 @@
 
 <file path=word/document.xml><?xml version="1.0" encoding="utf-8"?>
-<w:document xmlns:wpc="http://schemas.microsoft.com/office/word/2010/wordprocessingCanvas" xmlns:cx="http://schemas.microsoft.com/office/drawing/2014/chartex" xmlns:mc="http://schemas.openxmlformats.org/markup-compatibility/2006" xmlns:o="urn:schemas-microsoft-com:office:office" xmlns:r="http://schemas.openxmlformats.org/officeDocument/2006/relationships" xmlns:m="http://schemas.openxmlformats.org/officeDocument/2006/math" xmlns:v="urn:schemas-microsoft-com:vml" xmlns:wp14="http://schemas.microsoft.com/office/word/2010/wordprocessingDrawing" xmlns:wp="http://schemas.openxmlformats.org/drawingml/2006/wordprocessingDrawing" xmlns:w10="urn:schemas-microsoft-com:office:word" xmlns:w="http://schemas.openxmlformats.org/wordprocessingml/2006/main" xmlns:w14="http://schemas.microsoft.com/office/word/2010/wordml" xmlns:w15="http://schemas.microsoft.com/office/word/2012/wordml" xmlns:w16se="http://schemas.microsoft.com/office/word/2015/wordml/symex" xmlns:wpg="http://schemas.microsoft.com/office/word/2010/wordprocessingGroup" xmlns:wpi="http://schemas.microsoft.com/office/word/2010/wordprocessingInk" xmlns:wne="http://schemas.microsoft.com/office/word/2006/wordml" xmlns:wps="http://schemas.microsoft.com/office/word/2010/wordprocessingShape" mc:Ignorable="w14 w15 w16se wp14">
+<w:document xmlns:wpc="http://schemas.microsoft.com/office/word/2010/wordprocessingCanvas" xmlns:cx="http://schemas.microsoft.com/office/drawing/2014/chartex" xmlns:cx1="http://schemas.microsoft.com/office/drawing/2015/9/8/chartex" xmlns:mc="http://schemas.openxmlformats.org/markup-compatibility/2006" xmlns:o="urn:schemas-microsoft-com:office:office" xmlns:r="http://schemas.openxmlformats.org/officeDocument/2006/relationships" xmlns:m="http://schemas.openxmlformats.org/officeDocument/2006/math" xmlns:v="urn:schemas-microsoft-com:vml" xmlns:wp14="http://schemas.microsoft.com/office/word/2010/wordprocessingDrawing" xmlns:wp="http://schemas.openxmlformats.org/drawingml/2006/wordprocessingDrawing" xmlns:w10="urn:schemas-microsoft-com:office:word" xmlns:w="http://schemas.openxmlformats.org/wordprocessingml/2006/main" xmlns:w14="http://schemas.microsoft.com/office/word/2010/wordml" xmlns:w15="http://schemas.microsoft.com/office/word/2012/wordml" xmlns:w16se="http://schemas.microsoft.com/office/word/2015/wordml/symex" xmlns:wpg="http://schemas.microsoft.com/office/word/2010/wordprocessingGroup" xmlns:wpi="http://schemas.microsoft.com/office/word/2010/wordprocessingInk" xmlns:wne="http://schemas.microsoft.com/office/word/2006/wordml" xmlns:wps="http://schemas.microsoft.com/office/word/2010/wordprocessingShape" mc:Ignorable="w14 w15 w16se wp14">
   <w:body>
     <w:p>
       <w:pPr>
@@ -1869,7 +1869,23 @@
           <w:sz w:val="28"/>
           <w:szCs w:val="28"/>
         </w:rPr>
-        <w:t xml:space="preserve"> execute([$ten]) (Prepared Statement) </w:t>
+        <w:t xml:space="preserve"> </w:t>
+      </w:r>
+      <w:proofErr w:type="gramStart"/>
+      <w:r>
+        <w:rPr>
+          <w:sz w:val="28"/>
+          <w:szCs w:val="28"/>
+        </w:rPr>
+        <w:t>execute(</w:t>
+      </w:r>
+      <w:proofErr w:type="gramEnd"/>
+      <w:r>
+        <w:rPr>
+          <w:sz w:val="28"/>
+          <w:szCs w:val="28"/>
+        </w:rPr>
+        <w:t xml:space="preserve">[$ten]) (Prepared Statement) </w:t>
       </w:r>
       <w:proofErr w:type="spellStart"/>
       <w:r>
@@ -1932,6 +1948,852 @@
           <w:sz w:val="28"/>
           <w:szCs w:val="28"/>
         </w:rPr>
+        <w:t xml:space="preserve">5. </w:t>
+      </w:r>
+      <w:proofErr w:type="spellStart"/>
+      <w:r>
+        <w:rPr>
+          <w:sz w:val="28"/>
+          <w:szCs w:val="28"/>
+        </w:rPr>
+        <w:t>Trong</w:t>
+      </w:r>
+      <w:proofErr w:type="spellEnd"/>
+      <w:r>
+        <w:rPr>
+          <w:sz w:val="28"/>
+          <w:szCs w:val="28"/>
+        </w:rPr>
+        <w:t xml:space="preserve"> file views/</w:t>
+      </w:r>
+      <w:proofErr w:type="spellStart"/>
+      <w:r>
+        <w:rPr>
+          <w:sz w:val="28"/>
+          <w:szCs w:val="28"/>
+        </w:rPr>
+        <w:t>sinhvien_view.php</w:t>
+      </w:r>
+      <w:proofErr w:type="spellEnd"/>
+      <w:r>
+        <w:rPr>
+          <w:sz w:val="28"/>
+          <w:szCs w:val="28"/>
+        </w:rPr>
+        <w:t xml:space="preserve">, </w:t>
+      </w:r>
+      <w:proofErr w:type="spellStart"/>
+      <w:r>
+        <w:rPr>
+          <w:sz w:val="28"/>
+          <w:szCs w:val="28"/>
+        </w:rPr>
+        <w:t>tại</w:t>
+      </w:r>
+      <w:proofErr w:type="spellEnd"/>
+      <w:r>
+        <w:rPr>
+          <w:sz w:val="28"/>
+          <w:szCs w:val="28"/>
+        </w:rPr>
+        <w:t xml:space="preserve"> </w:t>
+      </w:r>
+      <w:proofErr w:type="spellStart"/>
+      <w:r>
+        <w:rPr>
+          <w:sz w:val="28"/>
+          <w:szCs w:val="28"/>
+        </w:rPr>
+        <w:t>sao</w:t>
+      </w:r>
+      <w:proofErr w:type="spellEnd"/>
+      <w:r>
+        <w:rPr>
+          <w:sz w:val="28"/>
+          <w:szCs w:val="28"/>
+        </w:rPr>
+        <w:t xml:space="preserve"> </w:t>
+      </w:r>
+      <w:proofErr w:type="spellStart"/>
+      <w:r>
+        <w:rPr>
+          <w:sz w:val="28"/>
+          <w:szCs w:val="28"/>
+        </w:rPr>
+        <w:t>chúng</w:t>
+      </w:r>
+      <w:proofErr w:type="spellEnd"/>
+      <w:r>
+        <w:rPr>
+          <w:sz w:val="28"/>
+          <w:szCs w:val="28"/>
+        </w:rPr>
+        <w:t xml:space="preserve"> ta </w:t>
+      </w:r>
+      <w:proofErr w:type="spellStart"/>
+      <w:r>
+        <w:rPr>
+          <w:sz w:val="28"/>
+          <w:szCs w:val="28"/>
+        </w:rPr>
+        <w:t>tuyệt</w:t>
+      </w:r>
+      <w:proofErr w:type="spellEnd"/>
+      <w:r>
+        <w:rPr>
+          <w:sz w:val="28"/>
+          <w:szCs w:val="28"/>
+        </w:rPr>
+        <w:t xml:space="preserve"> </w:t>
+      </w:r>
+      <w:proofErr w:type="spellStart"/>
+      <w:r>
+        <w:rPr>
+          <w:sz w:val="28"/>
+          <w:szCs w:val="28"/>
+        </w:rPr>
+        <w:t>đối</w:t>
+      </w:r>
+      <w:proofErr w:type="spellEnd"/>
+      <w:r>
+        <w:rPr>
+          <w:sz w:val="28"/>
+          <w:szCs w:val="28"/>
+        </w:rPr>
+        <w:t xml:space="preserve"> </w:t>
+      </w:r>
+      <w:proofErr w:type="spellStart"/>
+      <w:r>
+        <w:rPr>
+          <w:sz w:val="28"/>
+          <w:szCs w:val="28"/>
+        </w:rPr>
+        <w:t>không</w:t>
+      </w:r>
+      <w:proofErr w:type="spellEnd"/>
+      <w:r>
+        <w:rPr>
+          <w:sz w:val="28"/>
+          <w:szCs w:val="28"/>
+        </w:rPr>
+        <w:t xml:space="preserve"> </w:t>
+      </w:r>
+      <w:proofErr w:type="spellStart"/>
+      <w:r>
+        <w:rPr>
+          <w:sz w:val="28"/>
+          <w:szCs w:val="28"/>
+        </w:rPr>
+        <w:t>được</w:t>
+      </w:r>
+      <w:proofErr w:type="spellEnd"/>
+      <w:r>
+        <w:rPr>
+          <w:sz w:val="28"/>
+          <w:szCs w:val="28"/>
+        </w:rPr>
+        <w:t xml:space="preserve"> </w:t>
+      </w:r>
+      <w:proofErr w:type="spellStart"/>
+      <w:r>
+        <w:rPr>
+          <w:sz w:val="28"/>
+          <w:szCs w:val="28"/>
+        </w:rPr>
+        <w:t>phép</w:t>
+      </w:r>
+      <w:proofErr w:type="spellEnd"/>
+      <w:r>
+        <w:rPr>
+          <w:sz w:val="28"/>
+          <w:szCs w:val="28"/>
+        </w:rPr>
+        <w:t xml:space="preserve"> </w:t>
+      </w:r>
+      <w:proofErr w:type="spellStart"/>
+      <w:r>
+        <w:rPr>
+          <w:sz w:val="28"/>
+          <w:szCs w:val="28"/>
+        </w:rPr>
+        <w:t>viết</w:t>
+      </w:r>
+      <w:proofErr w:type="spellEnd"/>
+      <w:r>
+        <w:rPr>
+          <w:sz w:val="28"/>
+          <w:szCs w:val="28"/>
+        </w:rPr>
+        <w:t xml:space="preserve"> code </w:t>
+      </w:r>
+      <w:proofErr w:type="spellStart"/>
+      <w:r>
+        <w:rPr>
+          <w:sz w:val="28"/>
+          <w:szCs w:val="28"/>
+        </w:rPr>
+        <w:t>kết</w:t>
+      </w:r>
+      <w:proofErr w:type="spellEnd"/>
+      <w:r>
+        <w:rPr>
+          <w:sz w:val="28"/>
+          <w:szCs w:val="28"/>
+        </w:rPr>
+        <w:t xml:space="preserve"> </w:t>
+      </w:r>
+      <w:proofErr w:type="spellStart"/>
+      <w:r>
+        <w:rPr>
+          <w:sz w:val="28"/>
+          <w:szCs w:val="28"/>
+        </w:rPr>
+        <w:t>nối</w:t>
+      </w:r>
+      <w:proofErr w:type="spellEnd"/>
+      <w:r>
+        <w:rPr>
+          <w:sz w:val="28"/>
+          <w:szCs w:val="28"/>
+        </w:rPr>
+        <w:t xml:space="preserve"> PDO hay SELECT *? </w:t>
+      </w:r>
+      <w:proofErr w:type="spellStart"/>
+      <w:r>
+        <w:rPr>
+          <w:sz w:val="28"/>
+          <w:szCs w:val="28"/>
+        </w:rPr>
+        <w:t>Lợi</w:t>
+      </w:r>
+      <w:proofErr w:type="spellEnd"/>
+      <w:r>
+        <w:rPr>
+          <w:sz w:val="28"/>
+          <w:szCs w:val="28"/>
+        </w:rPr>
+        <w:t xml:space="preserve"> </w:t>
+      </w:r>
+      <w:proofErr w:type="spellStart"/>
+      <w:r>
+        <w:rPr>
+          <w:sz w:val="28"/>
+          <w:szCs w:val="28"/>
+        </w:rPr>
+        <w:t>ích</w:t>
+      </w:r>
+      <w:proofErr w:type="spellEnd"/>
+      <w:r>
+        <w:rPr>
+          <w:sz w:val="28"/>
+          <w:szCs w:val="28"/>
+        </w:rPr>
+        <w:t xml:space="preserve"> </w:t>
+      </w:r>
+      <w:proofErr w:type="spellStart"/>
+      <w:r>
+        <w:rPr>
+          <w:sz w:val="28"/>
+          <w:szCs w:val="28"/>
+        </w:rPr>
+        <w:t>của</w:t>
+      </w:r>
+      <w:proofErr w:type="spellEnd"/>
+      <w:r>
+        <w:rPr>
+          <w:sz w:val="28"/>
+          <w:szCs w:val="28"/>
+        </w:rPr>
+        <w:t xml:space="preserve"> </w:t>
+      </w:r>
+      <w:proofErr w:type="spellStart"/>
+      <w:r>
+        <w:rPr>
+          <w:sz w:val="28"/>
+          <w:szCs w:val="28"/>
+        </w:rPr>
+        <w:t>việc</w:t>
+      </w:r>
+      <w:proofErr w:type="spellEnd"/>
+      <w:r>
+        <w:rPr>
+          <w:sz w:val="28"/>
+          <w:szCs w:val="28"/>
+        </w:rPr>
+        <w:t xml:space="preserve"> '</w:t>
+      </w:r>
+      <w:proofErr w:type="spellStart"/>
+      <w:r>
+        <w:rPr>
+          <w:sz w:val="28"/>
+          <w:szCs w:val="28"/>
+        </w:rPr>
+        <w:t>cấm</w:t>
+      </w:r>
+      <w:proofErr w:type="spellEnd"/>
+      <w:r>
+        <w:rPr>
+          <w:sz w:val="28"/>
+          <w:szCs w:val="28"/>
+        </w:rPr>
+        <w:t xml:space="preserve">' View </w:t>
+      </w:r>
+      <w:proofErr w:type="spellStart"/>
+      <w:r>
+        <w:rPr>
+          <w:sz w:val="28"/>
+          <w:szCs w:val="28"/>
+        </w:rPr>
+        <w:t>làm</w:t>
+      </w:r>
+      <w:proofErr w:type="spellEnd"/>
+      <w:r>
+        <w:rPr>
+          <w:sz w:val="28"/>
+          <w:szCs w:val="28"/>
+        </w:rPr>
+        <w:t xml:space="preserve"> </w:t>
+      </w:r>
+      <w:proofErr w:type="spellStart"/>
+      <w:r>
+        <w:rPr>
+          <w:sz w:val="28"/>
+          <w:szCs w:val="28"/>
+        </w:rPr>
+        <w:t>việc</w:t>
+      </w:r>
+      <w:proofErr w:type="spellEnd"/>
+      <w:r>
+        <w:rPr>
+          <w:sz w:val="28"/>
+          <w:szCs w:val="28"/>
+        </w:rPr>
+        <w:t xml:space="preserve"> </w:t>
+      </w:r>
+      <w:proofErr w:type="spellStart"/>
+      <w:r>
+        <w:rPr>
+          <w:sz w:val="28"/>
+          <w:szCs w:val="28"/>
+        </w:rPr>
+        <w:t>trực</w:t>
+      </w:r>
+      <w:proofErr w:type="spellEnd"/>
+      <w:r>
+        <w:rPr>
+          <w:sz w:val="28"/>
+          <w:szCs w:val="28"/>
+        </w:rPr>
+        <w:t xml:space="preserve"> </w:t>
+      </w:r>
+      <w:proofErr w:type="spellStart"/>
+      <w:r>
+        <w:rPr>
+          <w:sz w:val="28"/>
+          <w:szCs w:val="28"/>
+        </w:rPr>
+        <w:t>tiếp</w:t>
+      </w:r>
+      <w:proofErr w:type="spellEnd"/>
+      <w:r>
+        <w:rPr>
+          <w:sz w:val="28"/>
+          <w:szCs w:val="28"/>
+        </w:rPr>
+        <w:t xml:space="preserve"> </w:t>
+      </w:r>
+      <w:proofErr w:type="spellStart"/>
+      <w:r>
+        <w:rPr>
+          <w:sz w:val="28"/>
+          <w:szCs w:val="28"/>
+        </w:rPr>
+        <w:t>với</w:t>
+      </w:r>
+      <w:proofErr w:type="spellEnd"/>
+      <w:r>
+        <w:rPr>
+          <w:sz w:val="28"/>
+          <w:szCs w:val="28"/>
+        </w:rPr>
+        <w:t xml:space="preserve"> CSDL </w:t>
+      </w:r>
+      <w:proofErr w:type="spellStart"/>
+      <w:r>
+        <w:rPr>
+          <w:sz w:val="28"/>
+          <w:szCs w:val="28"/>
+        </w:rPr>
+        <w:t>là</w:t>
+      </w:r>
+      <w:proofErr w:type="spellEnd"/>
+      <w:r>
+        <w:rPr>
+          <w:sz w:val="28"/>
+          <w:szCs w:val="28"/>
+        </w:rPr>
+        <w:t xml:space="preserve"> </w:t>
+      </w:r>
+      <w:proofErr w:type="spellStart"/>
+      <w:r>
+        <w:rPr>
+          <w:sz w:val="28"/>
+          <w:szCs w:val="28"/>
+        </w:rPr>
+        <w:t>gì</w:t>
+      </w:r>
+      <w:proofErr w:type="spellEnd"/>
+      <w:r>
+        <w:rPr>
+          <w:sz w:val="28"/>
+          <w:szCs w:val="28"/>
+        </w:rPr>
+        <w:t>?</w:t>
+      </w:r>
+    </w:p>
+    <w:p>
+      <w:pPr>
+        <w:rPr>
+          <w:sz w:val="28"/>
+          <w:szCs w:val="28"/>
+        </w:rPr>
+      </w:pPr>
+      <w:r>
+        <w:rPr>
+          <w:sz w:val="28"/>
+          <w:szCs w:val="28"/>
+        </w:rPr>
+        <w:t xml:space="preserve">6. </w:t>
+      </w:r>
+      <w:proofErr w:type="spellStart"/>
+      <w:r>
+        <w:rPr>
+          <w:sz w:val="28"/>
+          <w:szCs w:val="28"/>
+        </w:rPr>
+        <w:t>Hãy</w:t>
+      </w:r>
+      <w:proofErr w:type="spellEnd"/>
+      <w:r>
+        <w:rPr>
+          <w:sz w:val="28"/>
+          <w:szCs w:val="28"/>
+        </w:rPr>
+        <w:t xml:space="preserve"> so </w:t>
+      </w:r>
+      <w:proofErr w:type="spellStart"/>
+      <w:r>
+        <w:rPr>
+          <w:sz w:val="28"/>
+          <w:szCs w:val="28"/>
+        </w:rPr>
+        <w:t>sánh</w:t>
+      </w:r>
+      <w:proofErr w:type="spellEnd"/>
+      <w:r>
+        <w:rPr>
+          <w:sz w:val="28"/>
+          <w:szCs w:val="28"/>
+        </w:rPr>
+        <w:t xml:space="preserve"> file </w:t>
+      </w:r>
+      <w:proofErr w:type="spellStart"/>
+      <w:r>
+        <w:rPr>
+          <w:sz w:val="28"/>
+          <w:szCs w:val="28"/>
+        </w:rPr>
+        <w:t>index.php</w:t>
+      </w:r>
+      <w:proofErr w:type="spellEnd"/>
+      <w:r>
+        <w:rPr>
+          <w:sz w:val="28"/>
+          <w:szCs w:val="28"/>
+        </w:rPr>
+        <w:t xml:space="preserve"> (Controller) ở PHT </w:t>
+      </w:r>
+      <w:proofErr w:type="spellStart"/>
+      <w:r>
+        <w:rPr>
+          <w:sz w:val="28"/>
+          <w:szCs w:val="28"/>
+        </w:rPr>
+        <w:t>Chương</w:t>
+      </w:r>
+      <w:proofErr w:type="spellEnd"/>
+      <w:r>
+        <w:rPr>
+          <w:sz w:val="28"/>
+          <w:szCs w:val="28"/>
+        </w:rPr>
+        <w:t xml:space="preserve"> 5 </w:t>
+      </w:r>
+      <w:proofErr w:type="spellStart"/>
+      <w:r>
+        <w:rPr>
+          <w:sz w:val="28"/>
+          <w:szCs w:val="28"/>
+        </w:rPr>
+        <w:t>và</w:t>
+      </w:r>
+      <w:proofErr w:type="spellEnd"/>
+      <w:r>
+        <w:rPr>
+          <w:sz w:val="28"/>
+          <w:szCs w:val="28"/>
+        </w:rPr>
+        <w:t xml:space="preserve"> file routes/</w:t>
+      </w:r>
+      <w:proofErr w:type="spellStart"/>
+      <w:r>
+        <w:rPr>
+          <w:sz w:val="28"/>
+          <w:szCs w:val="28"/>
+        </w:rPr>
+        <w:t>web.php</w:t>
+      </w:r>
+      <w:proofErr w:type="spellEnd"/>
+      <w:r>
+        <w:rPr>
+          <w:sz w:val="28"/>
+          <w:szCs w:val="28"/>
+        </w:rPr>
+        <w:t xml:space="preserve"> ở PHT </w:t>
+      </w:r>
+      <w:proofErr w:type="spellStart"/>
+      <w:r>
+        <w:rPr>
+          <w:sz w:val="28"/>
+          <w:szCs w:val="28"/>
+        </w:rPr>
+        <w:t>này</w:t>
+      </w:r>
+      <w:proofErr w:type="spellEnd"/>
+      <w:r>
+        <w:rPr>
+          <w:sz w:val="28"/>
+          <w:szCs w:val="28"/>
+        </w:rPr>
+        <w:t xml:space="preserve">. </w:t>
+      </w:r>
+      <w:proofErr w:type="spellStart"/>
+      <w:r>
+        <w:rPr>
+          <w:sz w:val="28"/>
+          <w:szCs w:val="28"/>
+        </w:rPr>
+        <w:t>Tại</w:t>
+      </w:r>
+      <w:proofErr w:type="spellEnd"/>
+      <w:r>
+        <w:rPr>
+          <w:sz w:val="28"/>
+          <w:szCs w:val="28"/>
+        </w:rPr>
+        <w:t xml:space="preserve"> </w:t>
+      </w:r>
+      <w:proofErr w:type="spellStart"/>
+      <w:r>
+        <w:rPr>
+          <w:sz w:val="28"/>
+          <w:szCs w:val="28"/>
+        </w:rPr>
+        <w:t>sao</w:t>
+      </w:r>
+      <w:proofErr w:type="spellEnd"/>
+      <w:r>
+        <w:rPr>
+          <w:sz w:val="28"/>
+          <w:szCs w:val="28"/>
+        </w:rPr>
+        <w:t xml:space="preserve"> </w:t>
+      </w:r>
+      <w:proofErr w:type="spellStart"/>
+      <w:r>
+        <w:rPr>
+          <w:sz w:val="28"/>
+          <w:szCs w:val="28"/>
+        </w:rPr>
+        <w:t>Laravel</w:t>
+      </w:r>
+      <w:proofErr w:type="spellEnd"/>
+      <w:r>
+        <w:rPr>
+          <w:sz w:val="28"/>
+          <w:szCs w:val="28"/>
+        </w:rPr>
+        <w:t xml:space="preserve"> </w:t>
+      </w:r>
+      <w:proofErr w:type="spellStart"/>
+      <w:r>
+        <w:rPr>
+          <w:sz w:val="28"/>
+          <w:szCs w:val="28"/>
+        </w:rPr>
+        <w:t>lại</w:t>
+      </w:r>
+      <w:proofErr w:type="spellEnd"/>
+      <w:r>
+        <w:rPr>
+          <w:sz w:val="28"/>
+          <w:szCs w:val="28"/>
+        </w:rPr>
+        <w:t xml:space="preserve"> </w:t>
+      </w:r>
+      <w:proofErr w:type="spellStart"/>
+      <w:r>
+        <w:rPr>
+          <w:sz w:val="28"/>
+          <w:szCs w:val="28"/>
+        </w:rPr>
+        <w:t>tách</w:t>
+      </w:r>
+      <w:proofErr w:type="spellEnd"/>
+      <w:r>
+        <w:rPr>
+          <w:sz w:val="28"/>
+          <w:szCs w:val="28"/>
+        </w:rPr>
+        <w:t xml:space="preserve"> '</w:t>
+      </w:r>
+      <w:proofErr w:type="spellStart"/>
+      <w:r>
+        <w:rPr>
+          <w:sz w:val="28"/>
+          <w:szCs w:val="28"/>
+        </w:rPr>
+        <w:t>bảng</w:t>
+      </w:r>
+      <w:proofErr w:type="spellEnd"/>
+      <w:r>
+        <w:rPr>
+          <w:sz w:val="28"/>
+          <w:szCs w:val="28"/>
+        </w:rPr>
+        <w:t xml:space="preserve"> </w:t>
+      </w:r>
+      <w:proofErr w:type="spellStart"/>
+      <w:r>
+        <w:rPr>
+          <w:sz w:val="28"/>
+          <w:szCs w:val="28"/>
+        </w:rPr>
+        <w:t>chỉ</w:t>
+      </w:r>
+      <w:proofErr w:type="spellEnd"/>
+      <w:r>
+        <w:rPr>
+          <w:sz w:val="28"/>
+          <w:szCs w:val="28"/>
+        </w:rPr>
+        <w:t xml:space="preserve"> </w:t>
+      </w:r>
+      <w:proofErr w:type="spellStart"/>
+      <w:r>
+        <w:rPr>
+          <w:sz w:val="28"/>
+          <w:szCs w:val="28"/>
+        </w:rPr>
+        <w:t>dẫn</w:t>
+      </w:r>
+      <w:proofErr w:type="spellEnd"/>
+      <w:r>
+        <w:rPr>
+          <w:sz w:val="28"/>
+          <w:szCs w:val="28"/>
+        </w:rPr>
+        <w:t xml:space="preserve">' (Routing) </w:t>
+      </w:r>
+      <w:proofErr w:type="spellStart"/>
+      <w:r>
+        <w:rPr>
+          <w:sz w:val="28"/>
+          <w:szCs w:val="28"/>
+        </w:rPr>
+        <w:t>ra</w:t>
+      </w:r>
+      <w:proofErr w:type="spellEnd"/>
+      <w:r>
+        <w:rPr>
+          <w:sz w:val="28"/>
+          <w:szCs w:val="28"/>
+        </w:rPr>
+        <w:t xml:space="preserve"> </w:t>
+      </w:r>
+      <w:proofErr w:type="spellStart"/>
+      <w:r>
+        <w:rPr>
+          <w:sz w:val="28"/>
+          <w:szCs w:val="28"/>
+        </w:rPr>
+        <w:t>khỏi</w:t>
+      </w:r>
+      <w:proofErr w:type="spellEnd"/>
+      <w:r>
+        <w:rPr>
+          <w:sz w:val="28"/>
+          <w:szCs w:val="28"/>
+        </w:rPr>
+        <w:t xml:space="preserve"> '</w:t>
+      </w:r>
+      <w:proofErr w:type="spellStart"/>
+      <w:r>
+        <w:rPr>
+          <w:sz w:val="28"/>
+          <w:szCs w:val="28"/>
+        </w:rPr>
+        <w:t>bộ</w:t>
+      </w:r>
+      <w:proofErr w:type="spellEnd"/>
+      <w:r>
+        <w:rPr>
+          <w:sz w:val="28"/>
+          <w:szCs w:val="28"/>
+        </w:rPr>
+        <w:t xml:space="preserve"> </w:t>
+      </w:r>
+      <w:proofErr w:type="spellStart"/>
+      <w:r>
+        <w:rPr>
+          <w:sz w:val="28"/>
+          <w:szCs w:val="28"/>
+        </w:rPr>
+        <w:t>não</w:t>
+      </w:r>
+      <w:proofErr w:type="spellEnd"/>
+      <w:r>
+        <w:rPr>
+          <w:sz w:val="28"/>
+          <w:szCs w:val="28"/>
+        </w:rPr>
+        <w:t xml:space="preserve">' (Controller)? </w:t>
+      </w:r>
+      <w:proofErr w:type="spellStart"/>
+      <w:r>
+        <w:rPr>
+          <w:sz w:val="28"/>
+          <w:szCs w:val="28"/>
+        </w:rPr>
+        <w:t>Lợi</w:t>
+      </w:r>
+      <w:proofErr w:type="spellEnd"/>
+      <w:r>
+        <w:rPr>
+          <w:sz w:val="28"/>
+          <w:szCs w:val="28"/>
+        </w:rPr>
+        <w:t xml:space="preserve"> </w:t>
+      </w:r>
+      <w:proofErr w:type="spellStart"/>
+      <w:r>
+        <w:rPr>
+          <w:sz w:val="28"/>
+          <w:szCs w:val="28"/>
+        </w:rPr>
+        <w:t>ích</w:t>
+      </w:r>
+      <w:proofErr w:type="spellEnd"/>
+      <w:r>
+        <w:rPr>
+          <w:sz w:val="28"/>
+          <w:szCs w:val="28"/>
+        </w:rPr>
+        <w:t xml:space="preserve"> </w:t>
+      </w:r>
+      <w:proofErr w:type="spellStart"/>
+      <w:r>
+        <w:rPr>
+          <w:sz w:val="28"/>
+          <w:szCs w:val="28"/>
+        </w:rPr>
+        <w:t>của</w:t>
+      </w:r>
+      <w:proofErr w:type="spellEnd"/>
+      <w:r>
+        <w:rPr>
+          <w:sz w:val="28"/>
+          <w:szCs w:val="28"/>
+        </w:rPr>
+        <w:t xml:space="preserve"> </w:t>
+      </w:r>
+      <w:proofErr w:type="spellStart"/>
+      <w:r>
+        <w:rPr>
+          <w:sz w:val="28"/>
+          <w:szCs w:val="28"/>
+        </w:rPr>
+        <w:t>việc</w:t>
+      </w:r>
+      <w:proofErr w:type="spellEnd"/>
+      <w:r>
+        <w:rPr>
+          <w:sz w:val="28"/>
+          <w:szCs w:val="28"/>
+        </w:rPr>
+        <w:t xml:space="preserve"> </w:t>
+      </w:r>
+      <w:proofErr w:type="spellStart"/>
+      <w:r>
+        <w:rPr>
+          <w:sz w:val="28"/>
+          <w:szCs w:val="28"/>
+        </w:rPr>
+        <w:t>này</w:t>
+      </w:r>
+      <w:proofErr w:type="spellEnd"/>
+      <w:r>
+        <w:rPr>
+          <w:sz w:val="28"/>
+          <w:szCs w:val="28"/>
+        </w:rPr>
+        <w:t xml:space="preserve"> </w:t>
+      </w:r>
+      <w:proofErr w:type="spellStart"/>
+      <w:r>
+        <w:rPr>
+          <w:sz w:val="28"/>
+          <w:szCs w:val="28"/>
+        </w:rPr>
+        <w:t>là</w:t>
+      </w:r>
+      <w:proofErr w:type="spellEnd"/>
+      <w:r>
+        <w:rPr>
+          <w:sz w:val="28"/>
+          <w:szCs w:val="28"/>
+        </w:rPr>
+        <w:t xml:space="preserve"> </w:t>
+      </w:r>
+      <w:proofErr w:type="spellStart"/>
+      <w:r>
+        <w:rPr>
+          <w:sz w:val="28"/>
+          <w:szCs w:val="28"/>
+        </w:rPr>
+        <w:t>gì</w:t>
+      </w:r>
+      <w:proofErr w:type="spellEnd"/>
+      <w:r>
+        <w:rPr>
+          <w:sz w:val="28"/>
+          <w:szCs w:val="28"/>
+        </w:rPr>
+        <w:t>?</w:t>
+      </w:r>
+    </w:p>
+    <w:p>
+      <w:pPr>
+        <w:rPr>
+          <w:sz w:val="28"/>
+          <w:szCs w:val="28"/>
+        </w:rPr>
+      </w:pPr>
+      <w:r>
+        <w:rPr>
+          <w:sz w:val="28"/>
+          <w:szCs w:val="28"/>
+        </w:rPr>
         <w:softHyphen/>
       </w:r>
       <w:r>
@@ -1942,8 +2804,6 @@
         <w:softHyphen/>
         <w:t>-------------------------------------------------------------------------------------------------------------</w:t>
       </w:r>
-      <w:bookmarkStart w:id="0" w:name="_GoBack"/>
-      <w:bookmarkEnd w:id="0"/>
     </w:p>
     <w:p>
       <w:pPr>
@@ -2558,481 +3418,467 @@
           <w:sz w:val="28"/>
           <w:szCs w:val="28"/>
         </w:rPr>
-        <w:t xml:space="preserve"> </w:t>
-      </w:r>
+        <w:t xml:space="preserve"> 2 : </w:t>
+      </w:r>
+      <w:proofErr w:type="spellStart"/>
+      <w:r>
+        <w:rPr>
+          <w:sz w:val="28"/>
+          <w:szCs w:val="28"/>
+        </w:rPr>
+        <w:t>Về</w:t>
+      </w:r>
+      <w:proofErr w:type="spellEnd"/>
+      <w:r>
+        <w:rPr>
+          <w:sz w:val="28"/>
+          <w:szCs w:val="28"/>
+        </w:rPr>
+        <w:t xml:space="preserve"> </w:t>
+      </w:r>
+      <w:proofErr w:type="spellStart"/>
+      <w:r>
+        <w:rPr>
+          <w:sz w:val="28"/>
+          <w:szCs w:val="28"/>
+        </w:rPr>
+        <w:t>Đầu</w:t>
+      </w:r>
+      <w:proofErr w:type="spellEnd"/>
+      <w:r>
+        <w:rPr>
+          <w:sz w:val="28"/>
+          <w:szCs w:val="28"/>
+        </w:rPr>
+        <w:t xml:space="preserve"> </w:t>
+      </w:r>
+      <w:proofErr w:type="spellStart"/>
+      <w:r>
+        <w:rPr>
+          <w:sz w:val="28"/>
+          <w:szCs w:val="28"/>
+        </w:rPr>
+        <w:t>ra</w:t>
+      </w:r>
+      <w:proofErr w:type="spellEnd"/>
+      <w:r>
+        <w:rPr>
+          <w:sz w:val="28"/>
+          <w:szCs w:val="28"/>
+        </w:rPr>
+        <w:t xml:space="preserve"> (Output): </w:t>
+      </w:r>
+      <w:proofErr w:type="spellStart"/>
+      <w:r>
+        <w:rPr>
+          <w:sz w:val="28"/>
+          <w:szCs w:val="28"/>
+        </w:rPr>
+        <w:t>Sự</w:t>
+      </w:r>
+      <w:proofErr w:type="spellEnd"/>
+      <w:r>
+        <w:rPr>
+          <w:sz w:val="28"/>
+          <w:szCs w:val="28"/>
+        </w:rPr>
+        <w:t xml:space="preserve"> </w:t>
+      </w:r>
+      <w:proofErr w:type="spellStart"/>
+      <w:r>
+        <w:rPr>
+          <w:sz w:val="28"/>
+          <w:szCs w:val="28"/>
+        </w:rPr>
+        <w:t>khác</w:t>
+      </w:r>
+      <w:proofErr w:type="spellEnd"/>
+      <w:r>
+        <w:rPr>
+          <w:sz w:val="28"/>
+          <w:szCs w:val="28"/>
+        </w:rPr>
+        <w:t xml:space="preserve"> </w:t>
+      </w:r>
+      <w:proofErr w:type="spellStart"/>
+      <w:r>
+        <w:rPr>
+          <w:sz w:val="28"/>
+          <w:szCs w:val="28"/>
+        </w:rPr>
+        <w:t>biệt</w:t>
+      </w:r>
+      <w:proofErr w:type="spellEnd"/>
+      <w:r>
+        <w:rPr>
+          <w:sz w:val="28"/>
+          <w:szCs w:val="28"/>
+        </w:rPr>
+        <w:t xml:space="preserve"> </w:t>
+      </w:r>
+      <w:proofErr w:type="spellStart"/>
+      <w:r>
+        <w:rPr>
+          <w:sz w:val="28"/>
+          <w:szCs w:val="28"/>
+        </w:rPr>
+        <w:t>chính</w:t>
+      </w:r>
+      <w:proofErr w:type="spellEnd"/>
+      <w:r>
+        <w:rPr>
+          <w:sz w:val="28"/>
+          <w:szCs w:val="28"/>
+        </w:rPr>
+        <w:t xml:space="preserve"> </w:t>
+      </w:r>
+      <w:proofErr w:type="spellStart"/>
+      <w:r>
+        <w:rPr>
+          <w:sz w:val="28"/>
+          <w:szCs w:val="28"/>
+        </w:rPr>
+        <w:t>giữa</w:t>
+      </w:r>
+      <w:proofErr w:type="spellEnd"/>
+      <w:r>
+        <w:rPr>
+          <w:sz w:val="28"/>
+          <w:szCs w:val="28"/>
+        </w:rPr>
+        <w:t xml:space="preserve"> </w:t>
+      </w:r>
+      <w:proofErr w:type="spellStart"/>
+      <w:r>
+        <w:rPr>
+          <w:sz w:val="28"/>
+          <w:szCs w:val="28"/>
+        </w:rPr>
+        <w:t>việc</w:t>
+      </w:r>
+      <w:proofErr w:type="spellEnd"/>
+      <w:r>
+        <w:rPr>
+          <w:sz w:val="28"/>
+          <w:szCs w:val="28"/>
+        </w:rPr>
+        <w:t xml:space="preserve"> </w:t>
+      </w:r>
+      <w:proofErr w:type="spellStart"/>
+      <w:r>
+        <w:rPr>
+          <w:sz w:val="28"/>
+          <w:szCs w:val="28"/>
+        </w:rPr>
+        <w:t>sử</w:t>
+      </w:r>
+      <w:proofErr w:type="spellEnd"/>
+      <w:r>
+        <w:rPr>
+          <w:sz w:val="28"/>
+          <w:szCs w:val="28"/>
+        </w:rPr>
+        <w:t xml:space="preserve"> </w:t>
+      </w:r>
+      <w:proofErr w:type="spellStart"/>
+      <w:r>
+        <w:rPr>
+          <w:sz w:val="28"/>
+          <w:szCs w:val="28"/>
+        </w:rPr>
+        <w:t>dụng</w:t>
+      </w:r>
+      <w:proofErr w:type="spellEnd"/>
+      <w:r>
+        <w:rPr>
+          <w:sz w:val="28"/>
+          <w:szCs w:val="28"/>
+        </w:rPr>
+        <w:t xml:space="preserve"> echo </w:t>
+      </w:r>
+      <w:proofErr w:type="spellStart"/>
+      <w:r>
+        <w:rPr>
+          <w:sz w:val="28"/>
+          <w:szCs w:val="28"/>
+        </w:rPr>
+        <w:t>và</w:t>
+      </w:r>
+      <w:proofErr w:type="spellEnd"/>
+      <w:r>
+        <w:rPr>
+          <w:sz w:val="28"/>
+          <w:szCs w:val="28"/>
+        </w:rPr>
+        <w:t xml:space="preserve"> print  </w:t>
+      </w:r>
+      <w:proofErr w:type="spellStart"/>
+      <w:r>
+        <w:rPr>
+          <w:sz w:val="28"/>
+          <w:szCs w:val="28"/>
+        </w:rPr>
+        <w:t>để</w:t>
+      </w:r>
+      <w:proofErr w:type="spellEnd"/>
+      <w:r>
+        <w:rPr>
+          <w:sz w:val="28"/>
+          <w:szCs w:val="28"/>
+        </w:rPr>
+        <w:t xml:space="preserve"> in </w:t>
+      </w:r>
+      <w:proofErr w:type="spellStart"/>
+      <w:r>
+        <w:rPr>
+          <w:sz w:val="28"/>
+          <w:szCs w:val="28"/>
+        </w:rPr>
+        <w:t>ra</w:t>
+      </w:r>
+      <w:proofErr w:type="spellEnd"/>
+      <w:r>
+        <w:rPr>
+          <w:sz w:val="28"/>
+          <w:szCs w:val="28"/>
+        </w:rPr>
+        <w:t xml:space="preserve"> </w:t>
+      </w:r>
+      <w:proofErr w:type="spellStart"/>
+      <w:r>
+        <w:rPr>
+          <w:sz w:val="28"/>
+          <w:szCs w:val="28"/>
+        </w:rPr>
+        <w:t>màn</w:t>
+      </w:r>
+      <w:proofErr w:type="spellEnd"/>
+      <w:r>
+        <w:rPr>
+          <w:sz w:val="28"/>
+          <w:szCs w:val="28"/>
+        </w:rPr>
+        <w:t xml:space="preserve"> </w:t>
+      </w:r>
+      <w:proofErr w:type="spellStart"/>
+      <w:r>
+        <w:rPr>
+          <w:sz w:val="28"/>
+          <w:szCs w:val="28"/>
+        </w:rPr>
+        <w:t>hình</w:t>
+      </w:r>
+      <w:proofErr w:type="spellEnd"/>
+      <w:r>
+        <w:rPr>
+          <w:sz w:val="28"/>
+          <w:szCs w:val="28"/>
+        </w:rPr>
+        <w:t xml:space="preserve"> </w:t>
+      </w:r>
+      <w:proofErr w:type="spellStart"/>
+      <w:r>
+        <w:rPr>
+          <w:sz w:val="28"/>
+          <w:szCs w:val="28"/>
+        </w:rPr>
+        <w:t>trong</w:t>
+      </w:r>
+      <w:proofErr w:type="spellEnd"/>
+      <w:r>
+        <w:rPr>
+          <w:sz w:val="28"/>
+          <w:szCs w:val="28"/>
+        </w:rPr>
+        <w:t xml:space="preserve"> PHP </w:t>
+      </w:r>
+      <w:proofErr w:type="spellStart"/>
+      <w:r>
+        <w:rPr>
+          <w:sz w:val="28"/>
+          <w:szCs w:val="28"/>
+        </w:rPr>
+        <w:t>là</w:t>
+      </w:r>
+      <w:proofErr w:type="spellEnd"/>
+      <w:r>
+        <w:rPr>
+          <w:sz w:val="28"/>
+          <w:szCs w:val="28"/>
+        </w:rPr>
+        <w:t xml:space="preserve"> </w:t>
+      </w:r>
+      <w:proofErr w:type="spellStart"/>
+      <w:r>
+        <w:rPr>
+          <w:sz w:val="28"/>
+          <w:szCs w:val="28"/>
+        </w:rPr>
+        <w:t>gì</w:t>
+      </w:r>
+      <w:proofErr w:type="spellEnd"/>
+      <w:r>
+        <w:rPr>
+          <w:sz w:val="28"/>
+          <w:szCs w:val="28"/>
+        </w:rPr>
+        <w:t xml:space="preserve">, </w:t>
+      </w:r>
+      <w:proofErr w:type="spellStart"/>
+      <w:r>
+        <w:rPr>
+          <w:sz w:val="28"/>
+          <w:szCs w:val="28"/>
+        </w:rPr>
+        <w:t>và</w:t>
+      </w:r>
+      <w:proofErr w:type="spellEnd"/>
+      <w:r>
+        <w:rPr>
+          <w:sz w:val="28"/>
+          <w:szCs w:val="28"/>
+        </w:rPr>
+        <w:t xml:space="preserve"> </w:t>
+      </w:r>
+      <w:proofErr w:type="spellStart"/>
+      <w:r>
+        <w:rPr>
+          <w:sz w:val="28"/>
+          <w:szCs w:val="28"/>
+        </w:rPr>
+        <w:t>trong</w:t>
+      </w:r>
+      <w:proofErr w:type="spellEnd"/>
+      <w:r>
+        <w:rPr>
+          <w:sz w:val="28"/>
+          <w:szCs w:val="28"/>
+        </w:rPr>
+        <w:t xml:space="preserve"> </w:t>
+      </w:r>
+      <w:proofErr w:type="spellStart"/>
+      <w:r>
+        <w:rPr>
+          <w:sz w:val="28"/>
+          <w:szCs w:val="28"/>
+        </w:rPr>
+        <w:t>những</w:t>
+      </w:r>
+      <w:proofErr w:type="spellEnd"/>
+      <w:r>
+        <w:rPr>
+          <w:sz w:val="28"/>
+          <w:szCs w:val="28"/>
+        </w:rPr>
+        <w:t xml:space="preserve"> </w:t>
+      </w:r>
+      <w:proofErr w:type="spellStart"/>
+      <w:r>
+        <w:rPr>
+          <w:sz w:val="28"/>
+          <w:szCs w:val="28"/>
+        </w:rPr>
+        <w:t>trường</w:t>
+      </w:r>
+      <w:proofErr w:type="spellEnd"/>
+      <w:r>
+        <w:rPr>
+          <w:sz w:val="28"/>
+          <w:szCs w:val="28"/>
+        </w:rPr>
+        <w:t xml:space="preserve"> </w:t>
+      </w:r>
+      <w:proofErr w:type="spellStart"/>
+      <w:r>
+        <w:rPr>
+          <w:sz w:val="28"/>
+          <w:szCs w:val="28"/>
+        </w:rPr>
+        <w:t>hợp</w:t>
+      </w:r>
+      <w:proofErr w:type="spellEnd"/>
+      <w:r>
+        <w:rPr>
+          <w:sz w:val="28"/>
+          <w:szCs w:val="28"/>
+        </w:rPr>
+        <w:t xml:space="preserve"> </w:t>
+      </w:r>
+      <w:proofErr w:type="spellStart"/>
+      <w:r>
+        <w:rPr>
+          <w:sz w:val="28"/>
+          <w:szCs w:val="28"/>
+        </w:rPr>
+        <w:t>nào</w:t>
+      </w:r>
+      <w:proofErr w:type="spellEnd"/>
+      <w:r>
+        <w:rPr>
+          <w:sz w:val="28"/>
+          <w:szCs w:val="28"/>
+        </w:rPr>
+        <w:t xml:space="preserve"> </w:t>
+      </w:r>
+      <w:proofErr w:type="spellStart"/>
+      <w:r>
+        <w:rPr>
+          <w:sz w:val="28"/>
+          <w:szCs w:val="28"/>
+        </w:rPr>
+        <w:t>người</w:t>
+      </w:r>
+      <w:proofErr w:type="spellEnd"/>
+      <w:r>
+        <w:rPr>
+          <w:sz w:val="28"/>
+          <w:szCs w:val="28"/>
+        </w:rPr>
+        <w:t xml:space="preserve"> </w:t>
+      </w:r>
+      <w:proofErr w:type="spellStart"/>
+      <w:r>
+        <w:rPr>
+          <w:sz w:val="28"/>
+          <w:szCs w:val="28"/>
+        </w:rPr>
+        <w:t>lập</w:t>
+      </w:r>
+      <w:proofErr w:type="spellEnd"/>
+      <w:r>
+        <w:rPr>
+          <w:sz w:val="28"/>
+          <w:szCs w:val="28"/>
+        </w:rPr>
+        <w:t xml:space="preserve"> </w:t>
+      </w:r>
+      <w:proofErr w:type="spellStart"/>
+      <w:r>
+        <w:rPr>
+          <w:sz w:val="28"/>
+          <w:szCs w:val="28"/>
+        </w:rPr>
+        <w:t>trình</w:t>
+      </w:r>
+      <w:proofErr w:type="spellEnd"/>
+      <w:r>
+        <w:rPr>
+          <w:sz w:val="28"/>
+          <w:szCs w:val="28"/>
+        </w:rPr>
+        <w:t xml:space="preserve"> </w:t>
+      </w:r>
+      <w:proofErr w:type="spellStart"/>
       <w:proofErr w:type="gramStart"/>
       <w:r>
         <w:rPr>
           <w:sz w:val="28"/>
           <w:szCs w:val="28"/>
         </w:rPr>
-        <w:t>2 :</w:t>
-      </w:r>
+        <w:t>nên</w:t>
+      </w:r>
+      <w:proofErr w:type="spellEnd"/>
       <w:proofErr w:type="gramEnd"/>
-      <w:r>
-        <w:rPr>
-          <w:sz w:val="28"/>
-          <w:szCs w:val="28"/>
-        </w:rPr>
-        <w:t xml:space="preserve"> </w:t>
-      </w:r>
-      <w:proofErr w:type="spellStart"/>
-      <w:r>
-        <w:rPr>
-          <w:sz w:val="28"/>
-          <w:szCs w:val="28"/>
-        </w:rPr>
-        <w:t>Về</w:t>
-      </w:r>
-      <w:proofErr w:type="spellEnd"/>
-      <w:r>
-        <w:rPr>
-          <w:sz w:val="28"/>
-          <w:szCs w:val="28"/>
-        </w:rPr>
-        <w:t xml:space="preserve"> </w:t>
-      </w:r>
-      <w:proofErr w:type="spellStart"/>
-      <w:r>
-        <w:rPr>
-          <w:sz w:val="28"/>
-          <w:szCs w:val="28"/>
-        </w:rPr>
-        <w:t>Đầu</w:t>
-      </w:r>
-      <w:proofErr w:type="spellEnd"/>
-      <w:r>
-        <w:rPr>
-          <w:sz w:val="28"/>
-          <w:szCs w:val="28"/>
-        </w:rPr>
-        <w:t xml:space="preserve"> </w:t>
-      </w:r>
-      <w:proofErr w:type="spellStart"/>
-      <w:r>
-        <w:rPr>
-          <w:sz w:val="28"/>
-          <w:szCs w:val="28"/>
-        </w:rPr>
-        <w:t>ra</w:t>
-      </w:r>
-      <w:proofErr w:type="spellEnd"/>
-      <w:r>
-        <w:rPr>
-          <w:sz w:val="28"/>
-          <w:szCs w:val="28"/>
-        </w:rPr>
-        <w:t xml:space="preserve"> (Output): </w:t>
-      </w:r>
-      <w:proofErr w:type="spellStart"/>
-      <w:r>
-        <w:rPr>
-          <w:sz w:val="28"/>
-          <w:szCs w:val="28"/>
-        </w:rPr>
-        <w:t>Sự</w:t>
-      </w:r>
-      <w:proofErr w:type="spellEnd"/>
-      <w:r>
-        <w:rPr>
-          <w:sz w:val="28"/>
-          <w:szCs w:val="28"/>
-        </w:rPr>
-        <w:t xml:space="preserve"> </w:t>
-      </w:r>
-      <w:proofErr w:type="spellStart"/>
-      <w:r>
-        <w:rPr>
-          <w:sz w:val="28"/>
-          <w:szCs w:val="28"/>
-        </w:rPr>
-        <w:t>khác</w:t>
-      </w:r>
-      <w:proofErr w:type="spellEnd"/>
-      <w:r>
-        <w:rPr>
-          <w:sz w:val="28"/>
-          <w:szCs w:val="28"/>
-        </w:rPr>
-        <w:t xml:space="preserve"> </w:t>
-      </w:r>
-      <w:proofErr w:type="spellStart"/>
-      <w:r>
-        <w:rPr>
-          <w:sz w:val="28"/>
-          <w:szCs w:val="28"/>
-        </w:rPr>
-        <w:t>biệt</w:t>
-      </w:r>
-      <w:proofErr w:type="spellEnd"/>
-      <w:r>
-        <w:rPr>
-          <w:sz w:val="28"/>
-          <w:szCs w:val="28"/>
-        </w:rPr>
-        <w:t xml:space="preserve"> </w:t>
-      </w:r>
-      <w:proofErr w:type="spellStart"/>
-      <w:r>
-        <w:rPr>
-          <w:sz w:val="28"/>
-          <w:szCs w:val="28"/>
-        </w:rPr>
-        <w:t>chính</w:t>
-      </w:r>
-      <w:proofErr w:type="spellEnd"/>
-      <w:r>
-        <w:rPr>
-          <w:sz w:val="28"/>
-          <w:szCs w:val="28"/>
-        </w:rPr>
-        <w:t xml:space="preserve"> </w:t>
-      </w:r>
-      <w:proofErr w:type="spellStart"/>
-      <w:r>
-        <w:rPr>
-          <w:sz w:val="28"/>
-          <w:szCs w:val="28"/>
-        </w:rPr>
-        <w:t>giữa</w:t>
-      </w:r>
-      <w:proofErr w:type="spellEnd"/>
-      <w:r>
-        <w:rPr>
-          <w:sz w:val="28"/>
-          <w:szCs w:val="28"/>
-        </w:rPr>
-        <w:t xml:space="preserve"> </w:t>
-      </w:r>
-      <w:proofErr w:type="spellStart"/>
-      <w:r>
-        <w:rPr>
-          <w:sz w:val="28"/>
-          <w:szCs w:val="28"/>
-        </w:rPr>
-        <w:t>việc</w:t>
-      </w:r>
-      <w:proofErr w:type="spellEnd"/>
-      <w:r>
-        <w:rPr>
-          <w:sz w:val="28"/>
-          <w:szCs w:val="28"/>
-        </w:rPr>
-        <w:t xml:space="preserve"> </w:t>
-      </w:r>
-      <w:proofErr w:type="spellStart"/>
-      <w:r>
-        <w:rPr>
-          <w:sz w:val="28"/>
-          <w:szCs w:val="28"/>
-        </w:rPr>
-        <w:t>sử</w:t>
-      </w:r>
-      <w:proofErr w:type="spellEnd"/>
-      <w:r>
-        <w:rPr>
-          <w:sz w:val="28"/>
-          <w:szCs w:val="28"/>
-        </w:rPr>
-        <w:t xml:space="preserve"> </w:t>
-      </w:r>
-      <w:proofErr w:type="spellStart"/>
-      <w:r>
-        <w:rPr>
-          <w:sz w:val="28"/>
-          <w:szCs w:val="28"/>
-        </w:rPr>
-        <w:t>dụng</w:t>
-      </w:r>
-      <w:proofErr w:type="spellEnd"/>
-      <w:r>
-        <w:rPr>
-          <w:sz w:val="28"/>
-          <w:szCs w:val="28"/>
-        </w:rPr>
-        <w:t xml:space="preserve"> echo </w:t>
-      </w:r>
-      <w:proofErr w:type="spellStart"/>
-      <w:r>
-        <w:rPr>
-          <w:sz w:val="28"/>
-          <w:szCs w:val="28"/>
-        </w:rPr>
-        <w:t>và</w:t>
-      </w:r>
-      <w:proofErr w:type="spellEnd"/>
-      <w:r>
-        <w:rPr>
-          <w:sz w:val="28"/>
-          <w:szCs w:val="28"/>
-        </w:rPr>
-        <w:t xml:space="preserve"> print  </w:t>
-      </w:r>
-      <w:proofErr w:type="spellStart"/>
-      <w:r>
-        <w:rPr>
-          <w:sz w:val="28"/>
-          <w:szCs w:val="28"/>
-        </w:rPr>
-        <w:t>để</w:t>
-      </w:r>
-      <w:proofErr w:type="spellEnd"/>
-      <w:r>
-        <w:rPr>
-          <w:sz w:val="28"/>
-          <w:szCs w:val="28"/>
-        </w:rPr>
-        <w:t xml:space="preserve"> in </w:t>
-      </w:r>
-      <w:proofErr w:type="spellStart"/>
-      <w:r>
-        <w:rPr>
-          <w:sz w:val="28"/>
-          <w:szCs w:val="28"/>
-        </w:rPr>
-        <w:t>ra</w:t>
-      </w:r>
-      <w:proofErr w:type="spellEnd"/>
-      <w:r>
-        <w:rPr>
-          <w:sz w:val="28"/>
-          <w:szCs w:val="28"/>
-        </w:rPr>
-        <w:t xml:space="preserve"> </w:t>
-      </w:r>
-      <w:proofErr w:type="spellStart"/>
-      <w:r>
-        <w:rPr>
-          <w:sz w:val="28"/>
-          <w:szCs w:val="28"/>
-        </w:rPr>
-        <w:t>màn</w:t>
-      </w:r>
-      <w:proofErr w:type="spellEnd"/>
-      <w:r>
-        <w:rPr>
-          <w:sz w:val="28"/>
-          <w:szCs w:val="28"/>
-        </w:rPr>
-        <w:t xml:space="preserve"> </w:t>
-      </w:r>
-      <w:proofErr w:type="spellStart"/>
-      <w:r>
-        <w:rPr>
-          <w:sz w:val="28"/>
-          <w:szCs w:val="28"/>
-        </w:rPr>
-        <w:t>hình</w:t>
-      </w:r>
-      <w:proofErr w:type="spellEnd"/>
-      <w:r>
-        <w:rPr>
-          <w:sz w:val="28"/>
-          <w:szCs w:val="28"/>
-        </w:rPr>
-        <w:t xml:space="preserve"> </w:t>
-      </w:r>
-      <w:proofErr w:type="spellStart"/>
-      <w:r>
-        <w:rPr>
-          <w:sz w:val="28"/>
-          <w:szCs w:val="28"/>
-        </w:rPr>
-        <w:t>trong</w:t>
-      </w:r>
-      <w:proofErr w:type="spellEnd"/>
-      <w:r>
-        <w:rPr>
-          <w:sz w:val="28"/>
-          <w:szCs w:val="28"/>
-        </w:rPr>
-        <w:t xml:space="preserve"> PHP </w:t>
-      </w:r>
-      <w:proofErr w:type="spellStart"/>
-      <w:r>
-        <w:rPr>
-          <w:sz w:val="28"/>
-          <w:szCs w:val="28"/>
-        </w:rPr>
-        <w:t>là</w:t>
-      </w:r>
-      <w:proofErr w:type="spellEnd"/>
-      <w:r>
-        <w:rPr>
-          <w:sz w:val="28"/>
-          <w:szCs w:val="28"/>
-        </w:rPr>
-        <w:t xml:space="preserve"> </w:t>
-      </w:r>
-      <w:proofErr w:type="spellStart"/>
-      <w:r>
-        <w:rPr>
-          <w:sz w:val="28"/>
-          <w:szCs w:val="28"/>
-        </w:rPr>
-        <w:t>gì</w:t>
-      </w:r>
-      <w:proofErr w:type="spellEnd"/>
-      <w:r>
-        <w:rPr>
-          <w:sz w:val="28"/>
-          <w:szCs w:val="28"/>
-        </w:rPr>
-        <w:t xml:space="preserve">, </w:t>
-      </w:r>
-      <w:proofErr w:type="spellStart"/>
-      <w:r>
-        <w:rPr>
-          <w:sz w:val="28"/>
-          <w:szCs w:val="28"/>
-        </w:rPr>
-        <w:t>và</w:t>
-      </w:r>
-      <w:proofErr w:type="spellEnd"/>
-      <w:r>
-        <w:rPr>
-          <w:sz w:val="28"/>
-          <w:szCs w:val="28"/>
-        </w:rPr>
-        <w:t xml:space="preserve"> </w:t>
-      </w:r>
-      <w:proofErr w:type="spellStart"/>
-      <w:r>
-        <w:rPr>
-          <w:sz w:val="28"/>
-          <w:szCs w:val="28"/>
-        </w:rPr>
-        <w:t>trong</w:t>
-      </w:r>
-      <w:proofErr w:type="spellEnd"/>
-      <w:r>
-        <w:rPr>
-          <w:sz w:val="28"/>
-          <w:szCs w:val="28"/>
-        </w:rPr>
-        <w:t xml:space="preserve"> </w:t>
-      </w:r>
-      <w:proofErr w:type="spellStart"/>
-      <w:r>
-        <w:rPr>
-          <w:sz w:val="28"/>
-          <w:szCs w:val="28"/>
-        </w:rPr>
-        <w:t>những</w:t>
-      </w:r>
-      <w:proofErr w:type="spellEnd"/>
-      <w:r>
-        <w:rPr>
-          <w:sz w:val="28"/>
-          <w:szCs w:val="28"/>
-        </w:rPr>
-        <w:t xml:space="preserve"> </w:t>
-      </w:r>
-      <w:proofErr w:type="spellStart"/>
-      <w:r>
-        <w:rPr>
-          <w:sz w:val="28"/>
-          <w:szCs w:val="28"/>
-        </w:rPr>
-        <w:t>trường</w:t>
-      </w:r>
-      <w:proofErr w:type="spellEnd"/>
-      <w:r>
-        <w:rPr>
-          <w:sz w:val="28"/>
-          <w:szCs w:val="28"/>
-        </w:rPr>
-        <w:t xml:space="preserve"> </w:t>
-      </w:r>
-      <w:proofErr w:type="spellStart"/>
-      <w:r>
-        <w:rPr>
-          <w:sz w:val="28"/>
-          <w:szCs w:val="28"/>
-        </w:rPr>
-        <w:t>hợp</w:t>
-      </w:r>
-      <w:proofErr w:type="spellEnd"/>
-      <w:r>
-        <w:rPr>
-          <w:sz w:val="28"/>
-          <w:szCs w:val="28"/>
-        </w:rPr>
-        <w:t xml:space="preserve"> </w:t>
-      </w:r>
-      <w:proofErr w:type="spellStart"/>
-      <w:r>
-        <w:rPr>
-          <w:sz w:val="28"/>
-          <w:szCs w:val="28"/>
-        </w:rPr>
-        <w:t>nào</w:t>
-      </w:r>
-      <w:proofErr w:type="spellEnd"/>
-      <w:r>
-        <w:rPr>
-          <w:sz w:val="28"/>
-          <w:szCs w:val="28"/>
-        </w:rPr>
-        <w:t xml:space="preserve"> </w:t>
-      </w:r>
-      <w:proofErr w:type="spellStart"/>
-      <w:r>
-        <w:rPr>
-          <w:sz w:val="28"/>
-          <w:szCs w:val="28"/>
-        </w:rPr>
-        <w:t>người</w:t>
-      </w:r>
-      <w:proofErr w:type="spellEnd"/>
-      <w:r>
-        <w:rPr>
-          <w:sz w:val="28"/>
-          <w:szCs w:val="28"/>
-        </w:rPr>
-        <w:t xml:space="preserve"> </w:t>
-      </w:r>
-      <w:proofErr w:type="spellStart"/>
-      <w:r>
-        <w:rPr>
-          <w:sz w:val="28"/>
-          <w:szCs w:val="28"/>
-        </w:rPr>
-        <w:t>lập</w:t>
-      </w:r>
-      <w:proofErr w:type="spellEnd"/>
-      <w:r>
-        <w:rPr>
-          <w:sz w:val="28"/>
-          <w:szCs w:val="28"/>
-        </w:rPr>
-        <w:t xml:space="preserve"> </w:t>
-      </w:r>
-      <w:proofErr w:type="spellStart"/>
-      <w:r>
-        <w:rPr>
-          <w:sz w:val="28"/>
-          <w:szCs w:val="28"/>
-        </w:rPr>
-        <w:t>trình</w:t>
-      </w:r>
-      <w:proofErr w:type="spellEnd"/>
-      <w:r>
-        <w:rPr>
-          <w:sz w:val="28"/>
-          <w:szCs w:val="28"/>
-        </w:rPr>
-        <w:t xml:space="preserve"> </w:t>
-      </w:r>
-      <w:proofErr w:type="spellStart"/>
-      <w:r>
-        <w:rPr>
-          <w:sz w:val="28"/>
-          <w:szCs w:val="28"/>
-        </w:rPr>
-        <w:t>nên</w:t>
-      </w:r>
-      <w:proofErr w:type="spellEnd"/>
       <w:r>
         <w:rPr>
           <w:sz w:val="28"/>
@@ -3606,7 +4452,6 @@
           <w:sz w:val="28"/>
           <w:szCs w:val="28"/>
         </w:rPr>
-        <w:lastRenderedPageBreak/>
         <w:t>Chương</w:t>
       </w:r>
       <w:proofErr w:type="spellEnd"/>
@@ -4225,6 +5070,1379 @@
         </w:rPr>
         <w:t>?</w:t>
       </w:r>
+    </w:p>
+    <w:p>
+      <w:pPr>
+        <w:rPr>
+          <w:sz w:val="28"/>
+          <w:szCs w:val="28"/>
+        </w:rPr>
+      </w:pPr>
+    </w:p>
+    <w:p>
+      <w:pPr>
+        <w:rPr>
+          <w:sz w:val="28"/>
+          <w:szCs w:val="28"/>
+        </w:rPr>
+      </w:pPr>
+      <w:proofErr w:type="spellStart"/>
+      <w:r>
+        <w:rPr>
+          <w:sz w:val="28"/>
+          <w:szCs w:val="28"/>
+        </w:rPr>
+        <w:t>Chương</w:t>
+      </w:r>
+      <w:proofErr w:type="spellEnd"/>
+      <w:r>
+        <w:rPr>
+          <w:sz w:val="28"/>
+          <w:szCs w:val="28"/>
+        </w:rPr>
+        <w:t xml:space="preserve"> </w:t>
+      </w:r>
+      <w:proofErr w:type="gramStart"/>
+      <w:r>
+        <w:rPr>
+          <w:sz w:val="28"/>
+          <w:szCs w:val="28"/>
+        </w:rPr>
+        <w:t>5 :</w:t>
+      </w:r>
+      <w:proofErr w:type="gramEnd"/>
+      <w:r>
+        <w:rPr>
+          <w:sz w:val="28"/>
+          <w:szCs w:val="28"/>
+        </w:rPr>
+        <w:t xml:space="preserve"> </w:t>
+      </w:r>
+      <w:proofErr w:type="spellStart"/>
+      <w:r>
+        <w:rPr>
+          <w:sz w:val="28"/>
+          <w:szCs w:val="28"/>
+        </w:rPr>
+        <w:t>Trong</w:t>
+      </w:r>
+      <w:proofErr w:type="spellEnd"/>
+      <w:r>
+        <w:rPr>
+          <w:sz w:val="28"/>
+          <w:szCs w:val="28"/>
+        </w:rPr>
+        <w:t xml:space="preserve"> </w:t>
+      </w:r>
+      <w:proofErr w:type="spellStart"/>
+      <w:r>
+        <w:rPr>
+          <w:sz w:val="28"/>
+          <w:szCs w:val="28"/>
+        </w:rPr>
+        <w:t>mô</w:t>
+      </w:r>
+      <w:proofErr w:type="spellEnd"/>
+      <w:r>
+        <w:rPr>
+          <w:sz w:val="28"/>
+          <w:szCs w:val="28"/>
+        </w:rPr>
+        <w:t xml:space="preserve"> </w:t>
+      </w:r>
+      <w:proofErr w:type="spellStart"/>
+      <w:r>
+        <w:rPr>
+          <w:sz w:val="28"/>
+          <w:szCs w:val="28"/>
+        </w:rPr>
+        <w:t>hình</w:t>
+      </w:r>
+      <w:proofErr w:type="spellEnd"/>
+      <w:r>
+        <w:rPr>
+          <w:sz w:val="28"/>
+          <w:szCs w:val="28"/>
+        </w:rPr>
+        <w:t xml:space="preserve"> MVC </w:t>
+      </w:r>
+      <w:proofErr w:type="spellStart"/>
+      <w:r>
+        <w:rPr>
+          <w:sz w:val="28"/>
+          <w:szCs w:val="28"/>
+        </w:rPr>
+        <w:t>của</w:t>
+      </w:r>
+      <w:proofErr w:type="spellEnd"/>
+      <w:r>
+        <w:rPr>
+          <w:sz w:val="28"/>
+          <w:szCs w:val="28"/>
+        </w:rPr>
+        <w:t xml:space="preserve"> </w:t>
+      </w:r>
+      <w:proofErr w:type="spellStart"/>
+      <w:r>
+        <w:rPr>
+          <w:sz w:val="28"/>
+          <w:szCs w:val="28"/>
+        </w:rPr>
+        <w:t>bài</w:t>
+      </w:r>
+      <w:proofErr w:type="spellEnd"/>
+      <w:r>
+        <w:rPr>
+          <w:sz w:val="28"/>
+          <w:szCs w:val="28"/>
+        </w:rPr>
+        <w:t xml:space="preserve"> </w:t>
+      </w:r>
+      <w:proofErr w:type="spellStart"/>
+      <w:r>
+        <w:rPr>
+          <w:sz w:val="28"/>
+          <w:szCs w:val="28"/>
+        </w:rPr>
+        <w:t>thực</w:t>
+      </w:r>
+      <w:proofErr w:type="spellEnd"/>
+      <w:r>
+        <w:rPr>
+          <w:sz w:val="28"/>
+          <w:szCs w:val="28"/>
+        </w:rPr>
+        <w:t xml:space="preserve"> </w:t>
+      </w:r>
+      <w:proofErr w:type="spellStart"/>
+      <w:r>
+        <w:rPr>
+          <w:sz w:val="28"/>
+          <w:szCs w:val="28"/>
+        </w:rPr>
+        <w:t>hành</w:t>
+      </w:r>
+      <w:proofErr w:type="spellEnd"/>
+      <w:r>
+        <w:rPr>
+          <w:sz w:val="28"/>
+          <w:szCs w:val="28"/>
+        </w:rPr>
+        <w:t xml:space="preserve"> </w:t>
+      </w:r>
+      <w:proofErr w:type="spellStart"/>
+      <w:r>
+        <w:rPr>
+          <w:sz w:val="28"/>
+          <w:szCs w:val="28"/>
+        </w:rPr>
+        <w:t>này</w:t>
+      </w:r>
+      <w:proofErr w:type="spellEnd"/>
+      <w:r>
+        <w:rPr>
+          <w:sz w:val="28"/>
+          <w:szCs w:val="28"/>
+        </w:rPr>
+        <w:t xml:space="preserve">, </w:t>
+      </w:r>
+      <w:proofErr w:type="spellStart"/>
+      <w:r>
+        <w:rPr>
+          <w:sz w:val="28"/>
+          <w:szCs w:val="28"/>
+        </w:rPr>
+        <w:t>tại</w:t>
+      </w:r>
+      <w:proofErr w:type="spellEnd"/>
+      <w:r>
+        <w:rPr>
+          <w:sz w:val="28"/>
+          <w:szCs w:val="28"/>
+        </w:rPr>
+        <w:t xml:space="preserve"> </w:t>
+      </w:r>
+      <w:proofErr w:type="spellStart"/>
+      <w:r>
+        <w:rPr>
+          <w:sz w:val="28"/>
+          <w:szCs w:val="28"/>
+        </w:rPr>
+        <w:t>sao</w:t>
+      </w:r>
+      <w:proofErr w:type="spellEnd"/>
+      <w:r>
+        <w:rPr>
+          <w:sz w:val="28"/>
+          <w:szCs w:val="28"/>
+        </w:rPr>
+        <w:t xml:space="preserve"> Controller </w:t>
+      </w:r>
+      <w:proofErr w:type="spellStart"/>
+      <w:r>
+        <w:rPr>
+          <w:sz w:val="28"/>
+          <w:szCs w:val="28"/>
+        </w:rPr>
+        <w:t>phải</w:t>
+      </w:r>
+      <w:proofErr w:type="spellEnd"/>
+      <w:r>
+        <w:rPr>
+          <w:sz w:val="28"/>
+          <w:szCs w:val="28"/>
+        </w:rPr>
+        <w:t xml:space="preserve"> </w:t>
+      </w:r>
+      <w:proofErr w:type="spellStart"/>
+      <w:r>
+        <w:rPr>
+          <w:sz w:val="28"/>
+          <w:szCs w:val="28"/>
+        </w:rPr>
+        <w:t>là</w:t>
+      </w:r>
+      <w:proofErr w:type="spellEnd"/>
+      <w:r>
+        <w:rPr>
+          <w:sz w:val="28"/>
+          <w:szCs w:val="28"/>
+        </w:rPr>
+        <w:t xml:space="preserve"> </w:t>
+      </w:r>
+      <w:proofErr w:type="spellStart"/>
+      <w:r>
+        <w:rPr>
+          <w:sz w:val="28"/>
+          <w:szCs w:val="28"/>
+        </w:rPr>
+        <w:t>nơi</w:t>
+      </w:r>
+      <w:proofErr w:type="spellEnd"/>
+      <w:r>
+        <w:rPr>
+          <w:sz w:val="28"/>
+          <w:szCs w:val="28"/>
+        </w:rPr>
+        <w:t xml:space="preserve"> </w:t>
+      </w:r>
+      <w:proofErr w:type="spellStart"/>
+      <w:r>
+        <w:rPr>
+          <w:sz w:val="28"/>
+          <w:szCs w:val="28"/>
+        </w:rPr>
+        <w:t>duy</w:t>
+      </w:r>
+      <w:proofErr w:type="spellEnd"/>
+      <w:r>
+        <w:rPr>
+          <w:sz w:val="28"/>
+          <w:szCs w:val="28"/>
+        </w:rPr>
+        <w:t xml:space="preserve"> </w:t>
+      </w:r>
+      <w:proofErr w:type="spellStart"/>
+      <w:r>
+        <w:rPr>
+          <w:sz w:val="28"/>
+          <w:szCs w:val="28"/>
+        </w:rPr>
+        <w:t>nhất</w:t>
+      </w:r>
+      <w:proofErr w:type="spellEnd"/>
+      <w:r>
+        <w:rPr>
+          <w:sz w:val="28"/>
+          <w:szCs w:val="28"/>
+        </w:rPr>
+        <w:t xml:space="preserve"> </w:t>
+      </w:r>
+      <w:proofErr w:type="spellStart"/>
+      <w:r>
+        <w:rPr>
+          <w:sz w:val="28"/>
+          <w:szCs w:val="28"/>
+        </w:rPr>
+        <w:t>xử</w:t>
+      </w:r>
+      <w:proofErr w:type="spellEnd"/>
+      <w:r>
+        <w:rPr>
+          <w:sz w:val="28"/>
+          <w:szCs w:val="28"/>
+        </w:rPr>
+        <w:t xml:space="preserve"> </w:t>
+      </w:r>
+      <w:proofErr w:type="spellStart"/>
+      <w:r>
+        <w:rPr>
+          <w:sz w:val="28"/>
+          <w:szCs w:val="28"/>
+        </w:rPr>
+        <w:t>lý</w:t>
+      </w:r>
+      <w:proofErr w:type="spellEnd"/>
+      <w:r>
+        <w:rPr>
+          <w:sz w:val="28"/>
+          <w:szCs w:val="28"/>
+        </w:rPr>
+        <w:t xml:space="preserve"> </w:t>
+      </w:r>
+      <w:proofErr w:type="spellStart"/>
+      <w:r>
+        <w:rPr>
+          <w:sz w:val="28"/>
+          <w:szCs w:val="28"/>
+        </w:rPr>
+        <w:t>dữ</w:t>
+      </w:r>
+      <w:proofErr w:type="spellEnd"/>
+      <w:r>
+        <w:rPr>
+          <w:sz w:val="28"/>
+          <w:szCs w:val="28"/>
+        </w:rPr>
+        <w:t xml:space="preserve"> </w:t>
+      </w:r>
+      <w:proofErr w:type="spellStart"/>
+      <w:r>
+        <w:rPr>
+          <w:sz w:val="28"/>
+          <w:szCs w:val="28"/>
+        </w:rPr>
+        <w:t>liệu</w:t>
+      </w:r>
+      <w:proofErr w:type="spellEnd"/>
+      <w:r>
+        <w:rPr>
+          <w:sz w:val="28"/>
+          <w:szCs w:val="28"/>
+        </w:rPr>
+        <w:t xml:space="preserve"> </w:t>
+      </w:r>
+      <w:proofErr w:type="spellStart"/>
+      <w:r>
+        <w:rPr>
+          <w:sz w:val="28"/>
+          <w:szCs w:val="28"/>
+        </w:rPr>
+        <w:t>từ</w:t>
+      </w:r>
+      <w:proofErr w:type="spellEnd"/>
+      <w:r>
+        <w:rPr>
+          <w:sz w:val="28"/>
+          <w:szCs w:val="28"/>
+        </w:rPr>
+        <w:t xml:space="preserve"> form (</w:t>
+      </w:r>
+      <w:r>
+        <w:rPr>
+          <w:rStyle w:val="HTMLCode"/>
+          <w:rFonts w:eastAsiaTheme="minorHAnsi"/>
+          <w:sz w:val="28"/>
+          <w:szCs w:val="28"/>
+        </w:rPr>
+        <w:t>$_POST</w:t>
+      </w:r>
+      <w:r>
+        <w:rPr>
+          <w:sz w:val="28"/>
+          <w:szCs w:val="28"/>
+        </w:rPr>
+        <w:t xml:space="preserve">), </w:t>
+      </w:r>
+      <w:proofErr w:type="spellStart"/>
+      <w:r>
+        <w:rPr>
+          <w:sz w:val="28"/>
+          <w:szCs w:val="28"/>
+        </w:rPr>
+        <w:t>mà</w:t>
+      </w:r>
+      <w:proofErr w:type="spellEnd"/>
+      <w:r>
+        <w:rPr>
+          <w:sz w:val="28"/>
+          <w:szCs w:val="28"/>
+        </w:rPr>
+        <w:t xml:space="preserve"> </w:t>
+      </w:r>
+      <w:proofErr w:type="spellStart"/>
+      <w:r>
+        <w:rPr>
+          <w:sz w:val="28"/>
+          <w:szCs w:val="28"/>
+        </w:rPr>
+        <w:t>không</w:t>
+      </w:r>
+      <w:proofErr w:type="spellEnd"/>
+      <w:r>
+        <w:rPr>
+          <w:sz w:val="28"/>
+          <w:szCs w:val="28"/>
+        </w:rPr>
+        <w:t xml:space="preserve"> </w:t>
+      </w:r>
+      <w:proofErr w:type="spellStart"/>
+      <w:r>
+        <w:rPr>
+          <w:sz w:val="28"/>
+          <w:szCs w:val="28"/>
+        </w:rPr>
+        <w:t>cho</w:t>
+      </w:r>
+      <w:proofErr w:type="spellEnd"/>
+      <w:r>
+        <w:rPr>
+          <w:sz w:val="28"/>
+          <w:szCs w:val="28"/>
+        </w:rPr>
+        <w:t xml:space="preserve"> </w:t>
+      </w:r>
+      <w:proofErr w:type="spellStart"/>
+      <w:r>
+        <w:rPr>
+          <w:sz w:val="28"/>
+          <w:szCs w:val="28"/>
+        </w:rPr>
+        <w:t>phép</w:t>
+      </w:r>
+      <w:proofErr w:type="spellEnd"/>
+      <w:r>
+        <w:rPr>
+          <w:sz w:val="28"/>
+          <w:szCs w:val="28"/>
+        </w:rPr>
+        <w:t xml:space="preserve"> View </w:t>
+      </w:r>
+      <w:proofErr w:type="spellStart"/>
+      <w:r>
+        <w:rPr>
+          <w:sz w:val="28"/>
+          <w:szCs w:val="28"/>
+        </w:rPr>
+        <w:t>hoặc</w:t>
+      </w:r>
+      <w:proofErr w:type="spellEnd"/>
+      <w:r>
+        <w:rPr>
+          <w:sz w:val="28"/>
+          <w:szCs w:val="28"/>
+        </w:rPr>
+        <w:t xml:space="preserve"> Model </w:t>
+      </w:r>
+      <w:proofErr w:type="spellStart"/>
+      <w:r>
+        <w:rPr>
+          <w:sz w:val="28"/>
+          <w:szCs w:val="28"/>
+        </w:rPr>
+        <w:t>trực</w:t>
+      </w:r>
+      <w:proofErr w:type="spellEnd"/>
+      <w:r>
+        <w:rPr>
+          <w:sz w:val="28"/>
+          <w:szCs w:val="28"/>
+        </w:rPr>
+        <w:t xml:space="preserve"> </w:t>
+      </w:r>
+      <w:proofErr w:type="spellStart"/>
+      <w:r>
+        <w:rPr>
+          <w:sz w:val="28"/>
+          <w:szCs w:val="28"/>
+        </w:rPr>
+        <w:t>tiếp</w:t>
+      </w:r>
+      <w:proofErr w:type="spellEnd"/>
+      <w:r>
+        <w:rPr>
+          <w:sz w:val="28"/>
+          <w:szCs w:val="28"/>
+        </w:rPr>
+        <w:t xml:space="preserve"> </w:t>
+      </w:r>
+      <w:proofErr w:type="spellStart"/>
+      <w:r>
+        <w:rPr>
+          <w:sz w:val="28"/>
+          <w:szCs w:val="28"/>
+        </w:rPr>
+        <w:t>xử</w:t>
+      </w:r>
+      <w:proofErr w:type="spellEnd"/>
+      <w:r>
+        <w:rPr>
+          <w:sz w:val="28"/>
+          <w:szCs w:val="28"/>
+        </w:rPr>
+        <w:t xml:space="preserve"> </w:t>
+      </w:r>
+      <w:proofErr w:type="spellStart"/>
+      <w:r>
+        <w:rPr>
+          <w:sz w:val="28"/>
+          <w:szCs w:val="28"/>
+        </w:rPr>
+        <w:t>lý</w:t>
+      </w:r>
+      <w:proofErr w:type="spellEnd"/>
+      <w:r>
+        <w:rPr>
+          <w:sz w:val="28"/>
+          <w:szCs w:val="28"/>
+        </w:rPr>
+        <w:t xml:space="preserve"> </w:t>
+      </w:r>
+      <w:proofErr w:type="spellStart"/>
+      <w:r>
+        <w:rPr>
+          <w:sz w:val="28"/>
+          <w:szCs w:val="28"/>
+        </w:rPr>
+        <w:t>dữ</w:t>
+      </w:r>
+      <w:proofErr w:type="spellEnd"/>
+      <w:r>
+        <w:rPr>
+          <w:sz w:val="28"/>
+          <w:szCs w:val="28"/>
+        </w:rPr>
+        <w:t xml:space="preserve"> </w:t>
+      </w:r>
+      <w:proofErr w:type="spellStart"/>
+      <w:r>
+        <w:rPr>
+          <w:sz w:val="28"/>
+          <w:szCs w:val="28"/>
+        </w:rPr>
+        <w:t>liệu</w:t>
+      </w:r>
+      <w:proofErr w:type="spellEnd"/>
+      <w:r>
+        <w:rPr>
+          <w:sz w:val="28"/>
+          <w:szCs w:val="28"/>
+        </w:rPr>
+        <w:t xml:space="preserve"> </w:t>
+      </w:r>
+      <w:proofErr w:type="spellStart"/>
+      <w:r>
+        <w:rPr>
+          <w:sz w:val="28"/>
+          <w:szCs w:val="28"/>
+        </w:rPr>
+        <w:t>người</w:t>
+      </w:r>
+      <w:proofErr w:type="spellEnd"/>
+      <w:r>
+        <w:rPr>
+          <w:sz w:val="28"/>
+          <w:szCs w:val="28"/>
+        </w:rPr>
+        <w:t xml:space="preserve"> </w:t>
+      </w:r>
+      <w:proofErr w:type="spellStart"/>
+      <w:r>
+        <w:rPr>
+          <w:sz w:val="28"/>
+          <w:szCs w:val="28"/>
+        </w:rPr>
+        <w:t>dùng</w:t>
+      </w:r>
+      <w:proofErr w:type="spellEnd"/>
+      <w:r>
+        <w:rPr>
+          <w:sz w:val="28"/>
+          <w:szCs w:val="28"/>
+        </w:rPr>
+        <w:t xml:space="preserve"> </w:t>
+      </w:r>
+      <w:proofErr w:type="spellStart"/>
+      <w:r>
+        <w:rPr>
+          <w:sz w:val="28"/>
+          <w:szCs w:val="28"/>
+        </w:rPr>
+        <w:t>gửi</w:t>
+      </w:r>
+      <w:proofErr w:type="spellEnd"/>
+      <w:r>
+        <w:rPr>
+          <w:sz w:val="28"/>
+          <w:szCs w:val="28"/>
+        </w:rPr>
+        <w:t xml:space="preserve"> </w:t>
+      </w:r>
+      <w:proofErr w:type="spellStart"/>
+      <w:r>
+        <w:rPr>
+          <w:sz w:val="28"/>
+          <w:szCs w:val="28"/>
+        </w:rPr>
+        <w:t>lên</w:t>
+      </w:r>
+      <w:proofErr w:type="spellEnd"/>
+      <w:r>
+        <w:rPr>
+          <w:sz w:val="28"/>
+          <w:szCs w:val="28"/>
+        </w:rPr>
+        <w:t>?</w:t>
+      </w:r>
+    </w:p>
+    <w:p>
+      <w:pPr>
+        <w:rPr>
+          <w:sz w:val="28"/>
+          <w:szCs w:val="28"/>
+        </w:rPr>
+      </w:pPr>
+    </w:p>
+    <w:p>
+      <w:pPr>
+        <w:rPr>
+          <w:sz w:val="28"/>
+          <w:szCs w:val="28"/>
+        </w:rPr>
+      </w:pPr>
+      <w:proofErr w:type="spellStart"/>
+      <w:r>
+        <w:rPr>
+          <w:sz w:val="28"/>
+          <w:szCs w:val="28"/>
+        </w:rPr>
+        <w:t>Chương</w:t>
+      </w:r>
+      <w:proofErr w:type="spellEnd"/>
+      <w:r>
+        <w:rPr>
+          <w:sz w:val="28"/>
+          <w:szCs w:val="28"/>
+        </w:rPr>
+        <w:t xml:space="preserve"> </w:t>
+      </w:r>
+      <w:proofErr w:type="gramStart"/>
+      <w:r>
+        <w:rPr>
+          <w:sz w:val="28"/>
+          <w:szCs w:val="28"/>
+        </w:rPr>
+        <w:t>6 :</w:t>
+      </w:r>
+      <w:proofErr w:type="gramEnd"/>
+      <w:r>
+        <w:rPr>
+          <w:sz w:val="28"/>
+          <w:szCs w:val="28"/>
+        </w:rPr>
+        <w:t xml:space="preserve"> </w:t>
+      </w:r>
+      <w:proofErr w:type="spellStart"/>
+      <w:r>
+        <w:rPr>
+          <w:sz w:val="28"/>
+          <w:szCs w:val="28"/>
+        </w:rPr>
+        <w:t>Tại</w:t>
+      </w:r>
+      <w:proofErr w:type="spellEnd"/>
+      <w:r>
+        <w:rPr>
+          <w:sz w:val="28"/>
+          <w:szCs w:val="28"/>
+        </w:rPr>
+        <w:t xml:space="preserve"> </w:t>
+      </w:r>
+      <w:proofErr w:type="spellStart"/>
+      <w:r>
+        <w:rPr>
+          <w:sz w:val="28"/>
+          <w:szCs w:val="28"/>
+        </w:rPr>
+        <w:t>sao</w:t>
+      </w:r>
+      <w:proofErr w:type="spellEnd"/>
+      <w:r>
+        <w:rPr>
+          <w:sz w:val="28"/>
+          <w:szCs w:val="28"/>
+        </w:rPr>
+        <w:t xml:space="preserve"> </w:t>
+      </w:r>
+      <w:proofErr w:type="spellStart"/>
+      <w:r>
+        <w:rPr>
+          <w:sz w:val="28"/>
+          <w:szCs w:val="28"/>
+        </w:rPr>
+        <w:t>trong</w:t>
+      </w:r>
+      <w:proofErr w:type="spellEnd"/>
+      <w:r>
+        <w:rPr>
+          <w:sz w:val="28"/>
+          <w:szCs w:val="28"/>
+        </w:rPr>
+        <w:t xml:space="preserve"> </w:t>
+      </w:r>
+      <w:proofErr w:type="spellStart"/>
+      <w:r>
+        <w:rPr>
+          <w:sz w:val="28"/>
+          <w:szCs w:val="28"/>
+        </w:rPr>
+        <w:t>Laravel</w:t>
+      </w:r>
+      <w:proofErr w:type="spellEnd"/>
+      <w:r>
+        <w:rPr>
+          <w:sz w:val="28"/>
+          <w:szCs w:val="28"/>
+        </w:rPr>
+        <w:t xml:space="preserve">, </w:t>
+      </w:r>
+      <w:proofErr w:type="spellStart"/>
+      <w:r>
+        <w:rPr>
+          <w:sz w:val="28"/>
+          <w:szCs w:val="28"/>
+        </w:rPr>
+        <w:t>cơ</w:t>
+      </w:r>
+      <w:proofErr w:type="spellEnd"/>
+      <w:r>
+        <w:rPr>
+          <w:sz w:val="28"/>
+          <w:szCs w:val="28"/>
+        </w:rPr>
+        <w:t xml:space="preserve"> </w:t>
+      </w:r>
+      <w:proofErr w:type="spellStart"/>
+      <w:r>
+        <w:rPr>
+          <w:sz w:val="28"/>
+          <w:szCs w:val="28"/>
+        </w:rPr>
+        <w:t>chế</w:t>
+      </w:r>
+      <w:proofErr w:type="spellEnd"/>
+      <w:r>
+        <w:rPr>
+          <w:sz w:val="28"/>
+          <w:szCs w:val="28"/>
+        </w:rPr>
+        <w:t xml:space="preserve"> Routing </w:t>
+      </w:r>
+      <w:proofErr w:type="spellStart"/>
+      <w:r>
+        <w:rPr>
+          <w:sz w:val="28"/>
+          <w:szCs w:val="28"/>
+        </w:rPr>
+        <w:t>được</w:t>
+      </w:r>
+      <w:proofErr w:type="spellEnd"/>
+      <w:r>
+        <w:rPr>
+          <w:sz w:val="28"/>
+          <w:szCs w:val="28"/>
+        </w:rPr>
+        <w:t xml:space="preserve"> </w:t>
+      </w:r>
+      <w:proofErr w:type="spellStart"/>
+      <w:r>
+        <w:rPr>
+          <w:sz w:val="28"/>
+          <w:szCs w:val="28"/>
+        </w:rPr>
+        <w:t>tách</w:t>
+      </w:r>
+      <w:proofErr w:type="spellEnd"/>
+      <w:r>
+        <w:rPr>
+          <w:sz w:val="28"/>
+          <w:szCs w:val="28"/>
+        </w:rPr>
+        <w:t xml:space="preserve"> </w:t>
+      </w:r>
+      <w:proofErr w:type="spellStart"/>
+      <w:r>
+        <w:rPr>
+          <w:sz w:val="28"/>
+          <w:szCs w:val="28"/>
+        </w:rPr>
+        <w:t>riêng</w:t>
+      </w:r>
+      <w:proofErr w:type="spellEnd"/>
+      <w:r>
+        <w:rPr>
+          <w:sz w:val="28"/>
+          <w:szCs w:val="28"/>
+        </w:rPr>
+        <w:t xml:space="preserve"> </w:t>
+      </w:r>
+      <w:proofErr w:type="spellStart"/>
+      <w:r>
+        <w:rPr>
+          <w:sz w:val="28"/>
+          <w:szCs w:val="28"/>
+        </w:rPr>
+        <w:t>ra</w:t>
+      </w:r>
+      <w:proofErr w:type="spellEnd"/>
+      <w:r>
+        <w:rPr>
+          <w:sz w:val="28"/>
+          <w:szCs w:val="28"/>
+        </w:rPr>
+        <w:t xml:space="preserve"> </w:t>
+      </w:r>
+      <w:proofErr w:type="spellStart"/>
+      <w:r>
+        <w:rPr>
+          <w:sz w:val="28"/>
+          <w:szCs w:val="28"/>
+        </w:rPr>
+        <w:t>trong</w:t>
+      </w:r>
+      <w:proofErr w:type="spellEnd"/>
+      <w:r>
+        <w:rPr>
+          <w:sz w:val="28"/>
+          <w:szCs w:val="28"/>
+        </w:rPr>
+        <w:t xml:space="preserve"> file </w:t>
+      </w:r>
+      <w:r>
+        <w:rPr>
+          <w:rStyle w:val="HTMLCode"/>
+          <w:rFonts w:eastAsiaTheme="minorHAnsi"/>
+          <w:sz w:val="28"/>
+          <w:szCs w:val="28"/>
+        </w:rPr>
+        <w:t>routes/</w:t>
+      </w:r>
+      <w:proofErr w:type="spellStart"/>
+      <w:r>
+        <w:rPr>
+          <w:rStyle w:val="HTMLCode"/>
+          <w:rFonts w:eastAsiaTheme="minorHAnsi"/>
+          <w:sz w:val="28"/>
+          <w:szCs w:val="28"/>
+        </w:rPr>
+        <w:t>web.php</w:t>
+      </w:r>
+      <w:proofErr w:type="spellEnd"/>
+      <w:r>
+        <w:rPr>
+          <w:sz w:val="28"/>
+          <w:szCs w:val="28"/>
+        </w:rPr>
+        <w:t xml:space="preserve"> </w:t>
+      </w:r>
+      <w:proofErr w:type="spellStart"/>
+      <w:r>
+        <w:rPr>
+          <w:sz w:val="28"/>
+          <w:szCs w:val="28"/>
+        </w:rPr>
+        <w:t>thay</w:t>
+      </w:r>
+      <w:proofErr w:type="spellEnd"/>
+      <w:r>
+        <w:rPr>
+          <w:sz w:val="28"/>
+          <w:szCs w:val="28"/>
+        </w:rPr>
+        <w:t xml:space="preserve"> </w:t>
+      </w:r>
+      <w:proofErr w:type="spellStart"/>
+      <w:r>
+        <w:rPr>
+          <w:sz w:val="28"/>
+          <w:szCs w:val="28"/>
+        </w:rPr>
+        <w:t>vì</w:t>
+      </w:r>
+      <w:proofErr w:type="spellEnd"/>
+      <w:r>
+        <w:rPr>
+          <w:sz w:val="28"/>
+          <w:szCs w:val="28"/>
+        </w:rPr>
+        <w:t xml:space="preserve"> </w:t>
+      </w:r>
+      <w:proofErr w:type="spellStart"/>
+      <w:r>
+        <w:rPr>
+          <w:sz w:val="28"/>
+          <w:szCs w:val="28"/>
+        </w:rPr>
+        <w:t>viết</w:t>
+      </w:r>
+      <w:proofErr w:type="spellEnd"/>
+      <w:r>
+        <w:rPr>
+          <w:sz w:val="28"/>
+          <w:szCs w:val="28"/>
+        </w:rPr>
+        <w:t xml:space="preserve"> </w:t>
+      </w:r>
+      <w:proofErr w:type="spellStart"/>
+      <w:r>
+        <w:rPr>
+          <w:sz w:val="28"/>
+          <w:szCs w:val="28"/>
+        </w:rPr>
+        <w:t>trực</w:t>
+      </w:r>
+      <w:proofErr w:type="spellEnd"/>
+      <w:r>
+        <w:rPr>
+          <w:sz w:val="28"/>
+          <w:szCs w:val="28"/>
+        </w:rPr>
+        <w:t xml:space="preserve"> </w:t>
+      </w:r>
+      <w:proofErr w:type="spellStart"/>
+      <w:r>
+        <w:rPr>
+          <w:sz w:val="28"/>
+          <w:szCs w:val="28"/>
+        </w:rPr>
+        <w:t>tiếp</w:t>
+      </w:r>
+      <w:proofErr w:type="spellEnd"/>
+      <w:r>
+        <w:rPr>
+          <w:sz w:val="28"/>
+          <w:szCs w:val="28"/>
+        </w:rPr>
+        <w:t xml:space="preserve"> </w:t>
+      </w:r>
+      <w:proofErr w:type="spellStart"/>
+      <w:r>
+        <w:rPr>
+          <w:sz w:val="28"/>
+          <w:szCs w:val="28"/>
+        </w:rPr>
+        <w:t>các</w:t>
+      </w:r>
+      <w:proofErr w:type="spellEnd"/>
+      <w:r>
+        <w:rPr>
+          <w:sz w:val="28"/>
+          <w:szCs w:val="28"/>
+        </w:rPr>
+        <w:t xml:space="preserve"> URL </w:t>
+      </w:r>
+      <w:proofErr w:type="spellStart"/>
+      <w:r>
+        <w:rPr>
+          <w:sz w:val="28"/>
+          <w:szCs w:val="28"/>
+        </w:rPr>
+        <w:t>xử</w:t>
+      </w:r>
+      <w:proofErr w:type="spellEnd"/>
+      <w:r>
+        <w:rPr>
+          <w:sz w:val="28"/>
+          <w:szCs w:val="28"/>
+        </w:rPr>
+        <w:t xml:space="preserve"> </w:t>
+      </w:r>
+      <w:proofErr w:type="spellStart"/>
+      <w:r>
+        <w:rPr>
+          <w:sz w:val="28"/>
+          <w:szCs w:val="28"/>
+        </w:rPr>
+        <w:t>lý</w:t>
+      </w:r>
+      <w:proofErr w:type="spellEnd"/>
+      <w:r>
+        <w:rPr>
+          <w:sz w:val="28"/>
+          <w:szCs w:val="28"/>
+        </w:rPr>
+        <w:t xml:space="preserve"> </w:t>
+      </w:r>
+      <w:proofErr w:type="spellStart"/>
+      <w:r>
+        <w:rPr>
+          <w:sz w:val="28"/>
+          <w:szCs w:val="28"/>
+        </w:rPr>
+        <w:t>trong</w:t>
+      </w:r>
+      <w:proofErr w:type="spellEnd"/>
+      <w:r>
+        <w:rPr>
+          <w:sz w:val="28"/>
+          <w:szCs w:val="28"/>
+        </w:rPr>
+        <w:t xml:space="preserve"> Controller </w:t>
+      </w:r>
+      <w:proofErr w:type="spellStart"/>
+      <w:r>
+        <w:rPr>
+          <w:sz w:val="28"/>
+          <w:szCs w:val="28"/>
+        </w:rPr>
+        <w:t>như</w:t>
+      </w:r>
+      <w:proofErr w:type="spellEnd"/>
+      <w:r>
+        <w:rPr>
+          <w:sz w:val="28"/>
+          <w:szCs w:val="28"/>
+        </w:rPr>
+        <w:t xml:space="preserve"> </w:t>
+      </w:r>
+      <w:proofErr w:type="spellStart"/>
+      <w:r>
+        <w:rPr>
+          <w:sz w:val="28"/>
+          <w:szCs w:val="28"/>
+        </w:rPr>
+        <w:t>cách</w:t>
+      </w:r>
+      <w:proofErr w:type="spellEnd"/>
+      <w:r>
+        <w:rPr>
+          <w:sz w:val="28"/>
+          <w:szCs w:val="28"/>
+        </w:rPr>
+        <w:t xml:space="preserve"> </w:t>
+      </w:r>
+      <w:proofErr w:type="spellStart"/>
+      <w:r>
+        <w:rPr>
+          <w:sz w:val="28"/>
+          <w:szCs w:val="28"/>
+        </w:rPr>
+        <w:t>làm</w:t>
+      </w:r>
+      <w:proofErr w:type="spellEnd"/>
+      <w:r>
+        <w:rPr>
+          <w:sz w:val="28"/>
+          <w:szCs w:val="28"/>
+        </w:rPr>
+        <w:t xml:space="preserve"> ở PHP </w:t>
+      </w:r>
+      <w:proofErr w:type="spellStart"/>
+      <w:r>
+        <w:rPr>
+          <w:sz w:val="28"/>
+          <w:szCs w:val="28"/>
+        </w:rPr>
+        <w:t>thuần</w:t>
+      </w:r>
+      <w:proofErr w:type="spellEnd"/>
+      <w:r>
+        <w:rPr>
+          <w:sz w:val="28"/>
+          <w:szCs w:val="28"/>
+        </w:rPr>
+        <w:t xml:space="preserve"> (PHT </w:t>
+      </w:r>
+      <w:proofErr w:type="spellStart"/>
+      <w:r>
+        <w:rPr>
+          <w:sz w:val="28"/>
+          <w:szCs w:val="28"/>
+        </w:rPr>
+        <w:t>Chương</w:t>
+      </w:r>
+      <w:proofErr w:type="spellEnd"/>
+      <w:r>
+        <w:rPr>
+          <w:sz w:val="28"/>
+          <w:szCs w:val="28"/>
+        </w:rPr>
+        <w:t xml:space="preserve"> 5)? </w:t>
+      </w:r>
+      <w:proofErr w:type="spellStart"/>
+      <w:r>
+        <w:rPr>
+          <w:sz w:val="28"/>
+          <w:szCs w:val="28"/>
+        </w:rPr>
+        <w:t>Việc</w:t>
+      </w:r>
+      <w:proofErr w:type="spellEnd"/>
+      <w:r>
+        <w:rPr>
+          <w:sz w:val="28"/>
+          <w:szCs w:val="28"/>
+        </w:rPr>
+        <w:t xml:space="preserve"> </w:t>
+      </w:r>
+      <w:proofErr w:type="spellStart"/>
+      <w:r>
+        <w:rPr>
+          <w:sz w:val="28"/>
+          <w:szCs w:val="28"/>
+        </w:rPr>
+        <w:t>tách</w:t>
+      </w:r>
+      <w:proofErr w:type="spellEnd"/>
+      <w:r>
+        <w:rPr>
+          <w:sz w:val="28"/>
+          <w:szCs w:val="28"/>
+        </w:rPr>
+        <w:t xml:space="preserve"> </w:t>
+      </w:r>
+      <w:proofErr w:type="spellStart"/>
+      <w:r>
+        <w:rPr>
+          <w:sz w:val="28"/>
+          <w:szCs w:val="28"/>
+        </w:rPr>
+        <w:t>này</w:t>
+      </w:r>
+      <w:proofErr w:type="spellEnd"/>
+      <w:r>
+        <w:rPr>
+          <w:sz w:val="28"/>
+          <w:szCs w:val="28"/>
+        </w:rPr>
+        <w:t xml:space="preserve"> </w:t>
+      </w:r>
+      <w:proofErr w:type="spellStart"/>
+      <w:r>
+        <w:rPr>
+          <w:sz w:val="28"/>
+          <w:szCs w:val="28"/>
+        </w:rPr>
+        <w:t>mang</w:t>
+      </w:r>
+      <w:proofErr w:type="spellEnd"/>
+      <w:r>
+        <w:rPr>
+          <w:sz w:val="28"/>
+          <w:szCs w:val="28"/>
+        </w:rPr>
+        <w:t xml:space="preserve"> </w:t>
+      </w:r>
+      <w:proofErr w:type="spellStart"/>
+      <w:r>
+        <w:rPr>
+          <w:sz w:val="28"/>
+          <w:szCs w:val="28"/>
+        </w:rPr>
+        <w:t>lại</w:t>
+      </w:r>
+      <w:proofErr w:type="spellEnd"/>
+      <w:r>
+        <w:rPr>
+          <w:sz w:val="28"/>
+          <w:szCs w:val="28"/>
+        </w:rPr>
+        <w:t xml:space="preserve"> </w:t>
+      </w:r>
+      <w:proofErr w:type="spellStart"/>
+      <w:r>
+        <w:rPr>
+          <w:sz w:val="28"/>
+          <w:szCs w:val="28"/>
+        </w:rPr>
+        <w:t>lợi</w:t>
+      </w:r>
+      <w:proofErr w:type="spellEnd"/>
+      <w:r>
+        <w:rPr>
+          <w:sz w:val="28"/>
+          <w:szCs w:val="28"/>
+        </w:rPr>
+        <w:t xml:space="preserve"> </w:t>
+      </w:r>
+      <w:proofErr w:type="spellStart"/>
+      <w:r>
+        <w:rPr>
+          <w:sz w:val="28"/>
+          <w:szCs w:val="28"/>
+        </w:rPr>
+        <w:t>ích</w:t>
+      </w:r>
+      <w:proofErr w:type="spellEnd"/>
+      <w:r>
+        <w:rPr>
+          <w:sz w:val="28"/>
+          <w:szCs w:val="28"/>
+        </w:rPr>
+        <w:t xml:space="preserve"> </w:t>
+      </w:r>
+      <w:proofErr w:type="spellStart"/>
+      <w:r>
+        <w:rPr>
+          <w:sz w:val="28"/>
+          <w:szCs w:val="28"/>
+        </w:rPr>
+        <w:t>gì</w:t>
+      </w:r>
+      <w:proofErr w:type="spellEnd"/>
+      <w:r>
+        <w:rPr>
+          <w:sz w:val="28"/>
+          <w:szCs w:val="28"/>
+        </w:rPr>
+        <w:t xml:space="preserve"> </w:t>
+      </w:r>
+      <w:proofErr w:type="spellStart"/>
+      <w:r>
+        <w:rPr>
+          <w:sz w:val="28"/>
+          <w:szCs w:val="28"/>
+        </w:rPr>
+        <w:t>cho</w:t>
+      </w:r>
+      <w:proofErr w:type="spellEnd"/>
+      <w:r>
+        <w:rPr>
+          <w:sz w:val="28"/>
+          <w:szCs w:val="28"/>
+        </w:rPr>
+        <w:t xml:space="preserve"> </w:t>
+      </w:r>
+      <w:proofErr w:type="spellStart"/>
+      <w:r>
+        <w:rPr>
+          <w:sz w:val="28"/>
+          <w:szCs w:val="28"/>
+        </w:rPr>
+        <w:t>việc</w:t>
+      </w:r>
+      <w:proofErr w:type="spellEnd"/>
+      <w:r>
+        <w:rPr>
+          <w:sz w:val="28"/>
+          <w:szCs w:val="28"/>
+        </w:rPr>
+        <w:t xml:space="preserve"> </w:t>
+      </w:r>
+      <w:proofErr w:type="spellStart"/>
+      <w:r>
+        <w:rPr>
+          <w:sz w:val="28"/>
+          <w:szCs w:val="28"/>
+        </w:rPr>
+        <w:t>phát</w:t>
+      </w:r>
+      <w:proofErr w:type="spellEnd"/>
+      <w:r>
+        <w:rPr>
+          <w:sz w:val="28"/>
+          <w:szCs w:val="28"/>
+        </w:rPr>
+        <w:t xml:space="preserve"> </w:t>
+      </w:r>
+      <w:proofErr w:type="spellStart"/>
+      <w:r>
+        <w:rPr>
+          <w:sz w:val="28"/>
+          <w:szCs w:val="28"/>
+        </w:rPr>
+        <w:t>triển</w:t>
+      </w:r>
+      <w:proofErr w:type="spellEnd"/>
+      <w:r>
+        <w:rPr>
+          <w:sz w:val="28"/>
+          <w:szCs w:val="28"/>
+        </w:rPr>
+        <w:t xml:space="preserve"> </w:t>
+      </w:r>
+      <w:proofErr w:type="spellStart"/>
+      <w:r>
+        <w:rPr>
+          <w:sz w:val="28"/>
+          <w:szCs w:val="28"/>
+        </w:rPr>
+        <w:t>và</w:t>
+      </w:r>
+      <w:proofErr w:type="spellEnd"/>
+      <w:r>
+        <w:rPr>
+          <w:sz w:val="28"/>
+          <w:szCs w:val="28"/>
+        </w:rPr>
+        <w:t xml:space="preserve"> </w:t>
+      </w:r>
+      <w:proofErr w:type="spellStart"/>
+      <w:r>
+        <w:rPr>
+          <w:sz w:val="28"/>
+          <w:szCs w:val="28"/>
+        </w:rPr>
+        <w:t>bảo</w:t>
+      </w:r>
+      <w:proofErr w:type="spellEnd"/>
+      <w:r>
+        <w:rPr>
+          <w:sz w:val="28"/>
+          <w:szCs w:val="28"/>
+        </w:rPr>
+        <w:t xml:space="preserve"> </w:t>
+      </w:r>
+      <w:proofErr w:type="spellStart"/>
+      <w:r>
+        <w:rPr>
+          <w:sz w:val="28"/>
+          <w:szCs w:val="28"/>
+        </w:rPr>
+        <w:t>trì</w:t>
+      </w:r>
+      <w:proofErr w:type="spellEnd"/>
+      <w:r>
+        <w:rPr>
+          <w:sz w:val="28"/>
+          <w:szCs w:val="28"/>
+        </w:rPr>
+        <w:t xml:space="preserve"> </w:t>
+      </w:r>
+      <w:proofErr w:type="spellStart"/>
+      <w:r>
+        <w:rPr>
+          <w:sz w:val="28"/>
+          <w:szCs w:val="28"/>
+        </w:rPr>
+        <w:t>ứng</w:t>
+      </w:r>
+      <w:proofErr w:type="spellEnd"/>
+      <w:r>
+        <w:rPr>
+          <w:sz w:val="28"/>
+          <w:szCs w:val="28"/>
+        </w:rPr>
+        <w:t xml:space="preserve"> </w:t>
+      </w:r>
+      <w:proofErr w:type="spellStart"/>
+      <w:r>
+        <w:rPr>
+          <w:sz w:val="28"/>
+          <w:szCs w:val="28"/>
+        </w:rPr>
+        <w:t>dụng</w:t>
+      </w:r>
+      <w:proofErr w:type="spellEnd"/>
+      <w:r>
+        <w:rPr>
+          <w:sz w:val="28"/>
+          <w:szCs w:val="28"/>
+        </w:rPr>
+        <w:t>?</w:t>
+      </w:r>
+      <w:bookmarkStart w:id="0" w:name="_GoBack"/>
+      <w:bookmarkEnd w:id="0"/>
     </w:p>
     <w:sectPr>
       <w:pgSz w:w="12240" w:h="15840"/>
@@ -4657,6 +6875,19 @@
     <w:semiHidden/>
     <w:unhideWhenUsed/>
   </w:style>
+  <w:style w:type="character" w:styleId="HTMLCode">
+    <w:name w:val="HTML Code"/>
+    <w:basedOn w:val="DefaultParagraphFont"/>
+    <w:uiPriority w:val="99"/>
+    <w:semiHidden/>
+    <w:unhideWhenUsed/>
+    <w:rsid w:val="00ED6C6D"/>
+    <w:rPr>
+      <w:rFonts w:ascii="Courier New" w:eastAsia="Times New Roman" w:hAnsi="Courier New" w:cs="Courier New"/>
+      <w:sz w:val="20"/>
+      <w:szCs w:val="20"/>
+    </w:rPr>
+  </w:style>
 </w:styles>
 </file>
 

</xml_diff>